<commit_message>
chore: update daily inspection document for consistency
</commit_message>
<xml_diff>
--- a/storage/app/templates/Qalab-daily-inspection-f.docx
+++ b/storage/app/templates/Qalab-daily-inspection-f.docx
@@ -861,8 +861,30 @@
               <w:rPr>
                 <w:b/>
                 <w:bCs/>
-              </w:rPr>
-              <w:t>${equipment_code}</w:t>
+                <w:sz w:val="28"/>
+                <w:szCs w:val="28"/>
+              </w:rPr>
+              <w:t>${</w:t>
+            </w:r>
+            <w:proofErr w:type="spellStart"/>
+            <w:r>
+              <w:rPr>
+                <w:b/>
+                <w:bCs/>
+                <w:sz w:val="28"/>
+                <w:szCs w:val="28"/>
+              </w:rPr>
+              <w:t>equipment_code</w:t>
+            </w:r>
+            <w:proofErr w:type="spellEnd"/>
+            <w:r>
+              <w:rPr>
+                <w:b/>
+                <w:bCs/>
+                <w:sz w:val="28"/>
+                <w:szCs w:val="28"/>
+              </w:rPr>
+              <w:t>}</w:t>
             </w:r>
           </w:p>
         </w:tc>
@@ -971,8 +993,20 @@
                 <w:szCs w:val="20"/>
                 <w:rtl/>
               </w:rPr>
-              <w:t>2 يملأ بمعرفه المستفيد من المعده</w:t>
-            </w:r>
+              <w:t xml:space="preserve">2 يملأ بمعرفه المستفيد من </w:t>
+            </w:r>
+            <w:proofErr w:type="spellStart"/>
+            <w:r>
+              <w:rPr>
+                <w:b/>
+                <w:bCs/>
+                <w:sz w:val="20"/>
+                <w:szCs w:val="20"/>
+                <w:rtl/>
+              </w:rPr>
+              <w:t>المعده</w:t>
+            </w:r>
+            <w:proofErr w:type="spellEnd"/>
           </w:p>
           <w:p>
             <w:pPr>
@@ -1184,22 +1218,21 @@
                 <w:szCs w:val="20"/>
                 <w:rtl/>
               </w:rPr>
-              <w:t>رقم رخصة الشاحنه القلاب</w:t>
-            </w:r>
+              <w:t xml:space="preserve">رقم رخصة </w:t>
+            </w:r>
+            <w:proofErr w:type="spellStart"/>
             <w:r>
               <w:rPr>
                 <w:b/>
                 <w:bCs/>
                 <w:sz w:val="20"/>
                 <w:szCs w:val="20"/>
-              </w:rPr>
-              <w:t xml:space="preserve"> </w:t>
-            </w:r>
-          </w:p>
-          <w:p>
-            <w:pPr>
-              <w:spacing w:after="0" w:line="240" w:lineRule="auto"/>
-              <w:jc w:val="center"/>
+                <w:rtl/>
+              </w:rPr>
+              <w:t>الشاحنه</w:t>
+            </w:r>
+            <w:proofErr w:type="spellEnd"/>
+            <w:r>
               <w:rPr>
                 <w:b/>
                 <w:bCs/>
@@ -1207,7 +1240,8 @@
                 <w:szCs w:val="20"/>
                 <w:rtl/>
               </w:rPr>
-            </w:pPr>
+              <w:t xml:space="preserve"> القلاب</w:t>
+            </w:r>
             <w:r>
               <w:rPr>
                 <w:b/>
@@ -1215,7 +1249,7 @@
                 <w:sz w:val="20"/>
                 <w:szCs w:val="20"/>
               </w:rPr>
-              <w:t xml:space="preserve"> Dumper Reg. Issue</w:t>
+              <w:t xml:space="preserve"> </w:t>
             </w:r>
           </w:p>
           <w:p>
@@ -1227,19 +1261,41 @@
                 <w:bCs/>
                 <w:sz w:val="20"/>
                 <w:szCs w:val="20"/>
-              </w:rPr>
-            </w:pPr>
-          </w:p>
-          <w:p>
-            <w:pPr>
-              <w:spacing w:after="0" w:line="240" w:lineRule="auto"/>
-              <w:jc w:val="center"/>
+                <w:rtl/>
+              </w:rPr>
+            </w:pPr>
+            <w:r>
               <w:rPr>
                 <w:b/>
                 <w:bCs/>
                 <w:sz w:val="20"/>
                 <w:szCs w:val="20"/>
               </w:rPr>
+              <w:t xml:space="preserve"> Dumper Reg. Issue</w:t>
+            </w:r>
+          </w:p>
+          <w:p>
+            <w:pPr>
+              <w:spacing w:after="0" w:line="240" w:lineRule="auto"/>
+              <w:jc w:val="center"/>
+              <w:rPr>
+                <w:b/>
+                <w:bCs/>
+                <w:sz w:val="20"/>
+                <w:szCs w:val="20"/>
+              </w:rPr>
+            </w:pPr>
+          </w:p>
+          <w:p>
+            <w:pPr>
+              <w:spacing w:after="0" w:line="240" w:lineRule="auto"/>
+              <w:jc w:val="center"/>
+              <w:rPr>
+                <w:b/>
+                <w:bCs/>
+                <w:sz w:val="20"/>
+                <w:szCs w:val="20"/>
+              </w:rPr>
             </w:pPr>
             <w:r>
               <w:rPr>
@@ -1248,7 +1304,27 @@
                 <w:sz w:val="28"/>
                 <w:szCs w:val="28"/>
               </w:rPr>
-              <w:t>${equipment_number}</w:t>
+              <w:t>${</w:t>
+            </w:r>
+            <w:proofErr w:type="spellStart"/>
+            <w:r>
+              <w:rPr>
+                <w:b/>
+                <w:bCs/>
+                <w:sz w:val="28"/>
+                <w:szCs w:val="28"/>
+              </w:rPr>
+              <w:t>equipment_number</w:t>
+            </w:r>
+            <w:proofErr w:type="spellEnd"/>
+            <w:r>
+              <w:rPr>
+                <w:b/>
+                <w:bCs/>
+                <w:sz w:val="28"/>
+                <w:szCs w:val="28"/>
+              </w:rPr>
+              <w:t>}</w:t>
             </w:r>
           </w:p>
         </w:tc>
@@ -1276,7 +1352,29 @@
                 <w:szCs w:val="20"/>
                 <w:rtl/>
               </w:rPr>
-              <w:t>اسم سائق الشاحنه القلاب</w:t>
+              <w:t xml:space="preserve">اسم سائق </w:t>
+            </w:r>
+            <w:proofErr w:type="spellStart"/>
+            <w:r>
+              <w:rPr>
+                <w:b/>
+                <w:bCs/>
+                <w:sz w:val="20"/>
+                <w:szCs w:val="20"/>
+                <w:rtl/>
+              </w:rPr>
+              <w:t>الشاحنه</w:t>
+            </w:r>
+            <w:proofErr w:type="spellEnd"/>
+            <w:r>
+              <w:rPr>
+                <w:b/>
+                <w:bCs/>
+                <w:sz w:val="20"/>
+                <w:szCs w:val="20"/>
+                <w:rtl/>
+              </w:rPr>
+              <w:t xml:space="preserve"> القلاب</w:t>
             </w:r>
           </w:p>
           <w:p>
@@ -1386,18 +1484,21 @@
                 <w:szCs w:val="16"/>
                 <w:rtl/>
               </w:rPr>
-              <w:t>) اذا كانت نتيجة الفحص (نعم)، أو علامة (</w:t>
-            </w:r>
-            <w:r>
-              <w:rPr>
+              <w:t xml:space="preserve">) </w:t>
+            </w:r>
+            <w:proofErr w:type="gramStart"/>
+            <w:r>
+              <w:rPr>
+                <w:rFonts w:hint="cs"/>
                 <w:b/>
                 <w:bCs/>
                 <w:sz w:val="16"/>
                 <w:szCs w:val="16"/>
                 <w:rtl/>
               </w:rPr>
-              <w:t>×</w:t>
-            </w:r>
+              <w:t>اذا</w:t>
+            </w:r>
+            <w:proofErr w:type="gramEnd"/>
             <w:r>
               <w:rPr>
                 <w:rFonts w:hint="cs"/>
@@ -1407,29 +1508,30 @@
                 <w:szCs w:val="16"/>
                 <w:rtl/>
               </w:rPr>
-              <w:t>) اذا كانت نتيجة الفحص (لا)</w:t>
-            </w:r>
-          </w:p>
-          <w:p>
-            <w:pPr>
-              <w:spacing w:after="0" w:line="240" w:lineRule="auto"/>
-              <w:jc w:val="center"/>
+              <w:t xml:space="preserve"> كانت نتيجة الفحص (نعم)، أو علامة (</w:t>
+            </w:r>
+            <w:r>
               <w:rPr>
                 <w:b/>
                 <w:bCs/>
                 <w:sz w:val="16"/>
                 <w:szCs w:val="16"/>
-              </w:rPr>
-            </w:pPr>
-            <w:r>
-              <w:rPr>
+                <w:rtl/>
+              </w:rPr>
+              <w:t>×</w:t>
+            </w:r>
+            <w:r>
+              <w:rPr>
+                <w:rFonts w:hint="cs"/>
                 <w:b/>
                 <w:bCs/>
                 <w:sz w:val="16"/>
                 <w:szCs w:val="16"/>
-              </w:rPr>
-              <w:t>mark (√) if Check is positive and (×)</w:t>
-            </w:r>
+                <w:rtl/>
+              </w:rPr>
+              <w:t xml:space="preserve">) </w:t>
+            </w:r>
+            <w:proofErr w:type="gramStart"/>
             <w:r>
               <w:rPr>
                 <w:rFonts w:hint="cs"/>
@@ -1439,16 +1541,80 @@
                 <w:szCs w:val="16"/>
                 <w:rtl/>
               </w:rPr>
-              <w:t xml:space="preserve"> </w:t>
-            </w:r>
-            <w:r>
-              <w:rPr>
+              <w:t>اذا</w:t>
+            </w:r>
+            <w:proofErr w:type="gramEnd"/>
+            <w:r>
+              <w:rPr>
+                <w:rFonts w:hint="cs"/>
                 <w:b/>
                 <w:bCs/>
                 <w:sz w:val="16"/>
                 <w:szCs w:val="16"/>
-              </w:rPr>
-              <w:t xml:space="preserve"> if Check is negative</w:t>
+                <w:rtl/>
+              </w:rPr>
+              <w:t xml:space="preserve"> كانت نتيجة الفحص (لا)</w:t>
+            </w:r>
+          </w:p>
+          <w:p>
+            <w:pPr>
+              <w:spacing w:after="0" w:line="240" w:lineRule="auto"/>
+              <w:jc w:val="center"/>
+              <w:rPr>
+                <w:b/>
+                <w:bCs/>
+                <w:sz w:val="16"/>
+                <w:szCs w:val="16"/>
+              </w:rPr>
+            </w:pPr>
+            <w:r>
+              <w:rPr>
+                <w:b/>
+                <w:bCs/>
+                <w:sz w:val="16"/>
+                <w:szCs w:val="16"/>
+              </w:rPr>
+              <w:t>mark (√) if Check is positive and (</w:t>
+            </w:r>
+            <w:proofErr w:type="gramStart"/>
+            <w:r>
+              <w:rPr>
+                <w:b/>
+                <w:bCs/>
+                <w:sz w:val="16"/>
+                <w:szCs w:val="16"/>
+              </w:rPr>
+              <w:t>×)</w:t>
+            </w:r>
+            <w:r>
+              <w:rPr>
+                <w:rFonts w:hint="cs"/>
+                <w:b/>
+                <w:bCs/>
+                <w:sz w:val="16"/>
+                <w:szCs w:val="16"/>
+                <w:rtl/>
+              </w:rPr>
+              <w:t xml:space="preserve"> </w:t>
+            </w:r>
+            <w:r>
+              <w:rPr>
+                <w:b/>
+                <w:bCs/>
+                <w:sz w:val="16"/>
+                <w:szCs w:val="16"/>
+              </w:rPr>
+              <w:t xml:space="preserve"> if</w:t>
+            </w:r>
+            <w:proofErr w:type="gramEnd"/>
+            <w:r>
+              <w:rPr>
+                <w:b/>
+                <w:bCs/>
+                <w:sz w:val="16"/>
+                <w:szCs w:val="16"/>
+              </w:rPr>
+              <w:t xml:space="preserve"> Check is negative</w:t>
             </w:r>
           </w:p>
         </w:tc>
@@ -1878,7 +2044,27 @@
                 <w:bCs/>
                 <w:szCs w:val="28"/>
               </w:rPr>
-              <w:t>${fri_date}</w:t>
+              <w:t>${</w:t>
+            </w:r>
+            <w:proofErr w:type="spellStart"/>
+            <w:r>
+              <w:rPr>
+                <w:rFonts w:ascii="Times New Roman"/>
+                <w:b/>
+                <w:bCs/>
+                <w:szCs w:val="28"/>
+              </w:rPr>
+              <w:t>fri_date</w:t>
+            </w:r>
+            <w:proofErr w:type="spellEnd"/>
+            <w:r>
+              <w:rPr>
+                <w:rFonts w:ascii="Times New Roman"/>
+                <w:b/>
+                <w:bCs/>
+                <w:szCs w:val="28"/>
+              </w:rPr>
+              <w:t>}</w:t>
             </w:r>
           </w:p>
         </w:tc>
@@ -1904,7 +2090,27 @@
                 <w:bCs/>
                 <w:szCs w:val="28"/>
               </w:rPr>
-              <w:t>${thu_date}</w:t>
+              <w:t>${</w:t>
+            </w:r>
+            <w:proofErr w:type="spellStart"/>
+            <w:r>
+              <w:rPr>
+                <w:rFonts w:ascii="Times New Roman"/>
+                <w:b/>
+                <w:bCs/>
+                <w:szCs w:val="28"/>
+              </w:rPr>
+              <w:t>thu_date</w:t>
+            </w:r>
+            <w:proofErr w:type="spellEnd"/>
+            <w:r>
+              <w:rPr>
+                <w:rFonts w:ascii="Times New Roman"/>
+                <w:b/>
+                <w:bCs/>
+                <w:szCs w:val="28"/>
+              </w:rPr>
+              <w:t>}</w:t>
             </w:r>
           </w:p>
         </w:tc>
@@ -1930,7 +2136,27 @@
                 <w:bCs/>
                 <w:szCs w:val="28"/>
               </w:rPr>
-              <w:t>${wed_date}</w:t>
+              <w:t>${</w:t>
+            </w:r>
+            <w:proofErr w:type="spellStart"/>
+            <w:r>
+              <w:rPr>
+                <w:rFonts w:ascii="Times New Roman"/>
+                <w:b/>
+                <w:bCs/>
+                <w:szCs w:val="28"/>
+              </w:rPr>
+              <w:t>wed_date</w:t>
+            </w:r>
+            <w:proofErr w:type="spellEnd"/>
+            <w:r>
+              <w:rPr>
+                <w:rFonts w:ascii="Times New Roman"/>
+                <w:b/>
+                <w:bCs/>
+                <w:szCs w:val="28"/>
+              </w:rPr>
+              <w:t>}</w:t>
             </w:r>
           </w:p>
         </w:tc>
@@ -1956,7 +2182,27 @@
                 <w:bCs/>
                 <w:szCs w:val="28"/>
               </w:rPr>
-              <w:t>${tue_date}</w:t>
+              <w:t>${</w:t>
+            </w:r>
+            <w:proofErr w:type="spellStart"/>
+            <w:r>
+              <w:rPr>
+                <w:rFonts w:ascii="Times New Roman"/>
+                <w:b/>
+                <w:bCs/>
+                <w:szCs w:val="28"/>
+              </w:rPr>
+              <w:t>tue_date</w:t>
+            </w:r>
+            <w:proofErr w:type="spellEnd"/>
+            <w:r>
+              <w:rPr>
+                <w:rFonts w:ascii="Times New Roman"/>
+                <w:b/>
+                <w:bCs/>
+                <w:szCs w:val="28"/>
+              </w:rPr>
+              <w:t>}</w:t>
             </w:r>
           </w:p>
         </w:tc>
@@ -1982,7 +2228,27 @@
                 <w:bCs/>
                 <w:szCs w:val="28"/>
               </w:rPr>
-              <w:t>${mon_date}</w:t>
+              <w:t>${</w:t>
+            </w:r>
+            <w:proofErr w:type="spellStart"/>
+            <w:r>
+              <w:rPr>
+                <w:rFonts w:ascii="Times New Roman"/>
+                <w:b/>
+                <w:bCs/>
+                <w:szCs w:val="28"/>
+              </w:rPr>
+              <w:t>mon_date</w:t>
+            </w:r>
+            <w:proofErr w:type="spellEnd"/>
+            <w:r>
+              <w:rPr>
+                <w:rFonts w:ascii="Times New Roman"/>
+                <w:b/>
+                <w:bCs/>
+                <w:szCs w:val="28"/>
+              </w:rPr>
+              <w:t>}</w:t>
             </w:r>
           </w:p>
         </w:tc>
@@ -2008,7 +2274,27 @@
                 <w:bCs/>
                 <w:szCs w:val="28"/>
               </w:rPr>
-              <w:t>${sun_date}</w:t>
+              <w:t>${</w:t>
+            </w:r>
+            <w:proofErr w:type="spellStart"/>
+            <w:r>
+              <w:rPr>
+                <w:rFonts w:ascii="Times New Roman"/>
+                <w:b/>
+                <w:bCs/>
+                <w:szCs w:val="28"/>
+              </w:rPr>
+              <w:t>sun_date</w:t>
+            </w:r>
+            <w:proofErr w:type="spellEnd"/>
+            <w:r>
+              <w:rPr>
+                <w:rFonts w:ascii="Times New Roman"/>
+                <w:b/>
+                <w:bCs/>
+                <w:szCs w:val="28"/>
+              </w:rPr>
+              <w:t>}</w:t>
             </w:r>
           </w:p>
         </w:tc>
@@ -2034,7 +2320,27 @@
                 <w:bCs/>
                 <w:szCs w:val="28"/>
               </w:rPr>
-              <w:t>${sat_date}</w:t>
+              <w:t>${</w:t>
+            </w:r>
+            <w:proofErr w:type="spellStart"/>
+            <w:r>
+              <w:rPr>
+                <w:rFonts w:ascii="Times New Roman"/>
+                <w:b/>
+                <w:bCs/>
+                <w:szCs w:val="28"/>
+              </w:rPr>
+              <w:t>sat_date</w:t>
+            </w:r>
+            <w:proofErr w:type="spellEnd"/>
+            <w:r>
+              <w:rPr>
+                <w:rFonts w:ascii="Times New Roman"/>
+                <w:b/>
+                <w:bCs/>
+                <w:szCs w:val="28"/>
+              </w:rPr>
+              <w:t>}</w:t>
             </w:r>
           </w:p>
         </w:tc>
@@ -2122,19 +2428,9 @@
                 <w:szCs w:val="28"/>
                 <w:lang w:bidi="ar-EG"/>
               </w:rPr>
-              <w:t>${fri_daily}</w:t>
-            </w:r>
-          </w:p>
-        </w:tc>
-        <w:tc>
-          <w:tcPr>
-            <w:tcW w:w="1183" w:type="dxa"/>
-          </w:tcPr>
-          <w:p>
-            <w:pPr>
-              <w:spacing w:after="0"/>
-              <w:jc w:val="center"/>
-            </w:pPr>
+              <w:t>${</w:t>
+            </w:r>
+            <w:proofErr w:type="spellStart"/>
             <w:r>
               <w:rPr>
                 <w:rFonts w:ascii="Times New Roman"/>
@@ -2143,19 +2439,9 @@
                 <w:szCs w:val="28"/>
                 <w:lang w:bidi="ar-EG"/>
               </w:rPr>
-              <w:t>${thu_daily}</w:t>
-            </w:r>
-          </w:p>
-        </w:tc>
-        <w:tc>
-          <w:tcPr>
-            <w:tcW w:w="1110" w:type="dxa"/>
-          </w:tcPr>
-          <w:p>
-            <w:pPr>
-              <w:spacing w:after="0"/>
-              <w:jc w:val="center"/>
-            </w:pPr>
+              <w:t>fri_daily</w:t>
+            </w:r>
+            <w:proofErr w:type="spellEnd"/>
             <w:r>
               <w:rPr>
                 <w:rFonts w:ascii="Times New Roman"/>
@@ -2164,13 +2450,13 @@
                 <w:szCs w:val="28"/>
                 <w:lang w:bidi="ar-EG"/>
               </w:rPr>
-              <w:t>${wed_daily}</w:t>
-            </w:r>
-          </w:p>
-        </w:tc>
-        <w:tc>
-          <w:tcPr>
-            <w:tcW w:w="1112" w:type="dxa"/>
+              <w:t>}</w:t>
+            </w:r>
+          </w:p>
+        </w:tc>
+        <w:tc>
+          <w:tcPr>
+            <w:tcW w:w="1183" w:type="dxa"/>
           </w:tcPr>
           <w:p>
             <w:pPr>
@@ -2185,19 +2471,9 @@
                 <w:szCs w:val="28"/>
                 <w:lang w:bidi="ar-EG"/>
               </w:rPr>
-              <w:t>${tue_daily}</w:t>
-            </w:r>
-          </w:p>
-        </w:tc>
-        <w:tc>
-          <w:tcPr>
-            <w:tcW w:w="1065" w:type="dxa"/>
-          </w:tcPr>
-          <w:p>
-            <w:pPr>
-              <w:spacing w:after="0"/>
-              <w:jc w:val="center"/>
-            </w:pPr>
+              <w:t>${</w:t>
+            </w:r>
+            <w:proofErr w:type="spellStart"/>
             <w:r>
               <w:rPr>
                 <w:rFonts w:ascii="Times New Roman"/>
@@ -2206,19 +2482,9 @@
                 <w:szCs w:val="28"/>
                 <w:lang w:bidi="ar-EG"/>
               </w:rPr>
-              <w:t>${mon_daily}</w:t>
-            </w:r>
-          </w:p>
-        </w:tc>
-        <w:tc>
-          <w:tcPr>
-            <w:tcW w:w="1126" w:type="dxa"/>
-          </w:tcPr>
-          <w:p>
-            <w:pPr>
-              <w:spacing w:after="0"/>
-              <w:jc w:val="center"/>
-            </w:pPr>
+              <w:t>thu_daily</w:t>
+            </w:r>
+            <w:proofErr w:type="spellEnd"/>
             <w:r>
               <w:rPr>
                 <w:rFonts w:ascii="Times New Roman"/>
@@ -2227,13 +2493,13 @@
                 <w:szCs w:val="28"/>
                 <w:lang w:bidi="ar-EG"/>
               </w:rPr>
-              <w:t>${sun_daily}</w:t>
-            </w:r>
-          </w:p>
-        </w:tc>
-        <w:tc>
-          <w:tcPr>
-            <w:tcW w:w="1216" w:type="dxa"/>
+              <w:t>}</w:t>
+            </w:r>
+          </w:p>
+        </w:tc>
+        <w:tc>
+          <w:tcPr>
+            <w:tcW w:w="1110" w:type="dxa"/>
           </w:tcPr>
           <w:p>
             <w:pPr>
@@ -2248,7 +2514,201 @@
                 <w:szCs w:val="28"/>
                 <w:lang w:bidi="ar-EG"/>
               </w:rPr>
-              <w:t>${sat_daily}</w:t>
+              <w:t>${</w:t>
+            </w:r>
+            <w:proofErr w:type="spellStart"/>
+            <w:r>
+              <w:rPr>
+                <w:rFonts w:ascii="Times New Roman"/>
+                <w:b/>
+                <w:bCs/>
+                <w:szCs w:val="28"/>
+                <w:lang w:bidi="ar-EG"/>
+              </w:rPr>
+              <w:t>wed_daily</w:t>
+            </w:r>
+            <w:proofErr w:type="spellEnd"/>
+            <w:r>
+              <w:rPr>
+                <w:rFonts w:ascii="Times New Roman"/>
+                <w:b/>
+                <w:bCs/>
+                <w:szCs w:val="28"/>
+                <w:lang w:bidi="ar-EG"/>
+              </w:rPr>
+              <w:t>}</w:t>
+            </w:r>
+          </w:p>
+        </w:tc>
+        <w:tc>
+          <w:tcPr>
+            <w:tcW w:w="1112" w:type="dxa"/>
+          </w:tcPr>
+          <w:p>
+            <w:pPr>
+              <w:spacing w:after="0"/>
+              <w:jc w:val="center"/>
+            </w:pPr>
+            <w:r>
+              <w:rPr>
+                <w:rFonts w:ascii="Times New Roman"/>
+                <w:b/>
+                <w:bCs/>
+                <w:szCs w:val="28"/>
+                <w:lang w:bidi="ar-EG"/>
+              </w:rPr>
+              <w:t>${</w:t>
+            </w:r>
+            <w:proofErr w:type="spellStart"/>
+            <w:r>
+              <w:rPr>
+                <w:rFonts w:ascii="Times New Roman"/>
+                <w:b/>
+                <w:bCs/>
+                <w:szCs w:val="28"/>
+                <w:lang w:bidi="ar-EG"/>
+              </w:rPr>
+              <w:t>tue_daily</w:t>
+            </w:r>
+            <w:proofErr w:type="spellEnd"/>
+            <w:r>
+              <w:rPr>
+                <w:rFonts w:ascii="Times New Roman"/>
+                <w:b/>
+                <w:bCs/>
+                <w:szCs w:val="28"/>
+                <w:lang w:bidi="ar-EG"/>
+              </w:rPr>
+              <w:t>}</w:t>
+            </w:r>
+          </w:p>
+        </w:tc>
+        <w:tc>
+          <w:tcPr>
+            <w:tcW w:w="1065" w:type="dxa"/>
+          </w:tcPr>
+          <w:p>
+            <w:pPr>
+              <w:spacing w:after="0"/>
+              <w:jc w:val="center"/>
+            </w:pPr>
+            <w:r>
+              <w:rPr>
+                <w:rFonts w:ascii="Times New Roman"/>
+                <w:b/>
+                <w:bCs/>
+                <w:szCs w:val="28"/>
+                <w:lang w:bidi="ar-EG"/>
+              </w:rPr>
+              <w:t>${</w:t>
+            </w:r>
+            <w:proofErr w:type="spellStart"/>
+            <w:r>
+              <w:rPr>
+                <w:rFonts w:ascii="Times New Roman"/>
+                <w:b/>
+                <w:bCs/>
+                <w:szCs w:val="28"/>
+                <w:lang w:bidi="ar-EG"/>
+              </w:rPr>
+              <w:t>mon_daily</w:t>
+            </w:r>
+            <w:proofErr w:type="spellEnd"/>
+            <w:r>
+              <w:rPr>
+                <w:rFonts w:ascii="Times New Roman"/>
+                <w:b/>
+                <w:bCs/>
+                <w:szCs w:val="28"/>
+                <w:lang w:bidi="ar-EG"/>
+              </w:rPr>
+              <w:t>}</w:t>
+            </w:r>
+          </w:p>
+        </w:tc>
+        <w:tc>
+          <w:tcPr>
+            <w:tcW w:w="1126" w:type="dxa"/>
+          </w:tcPr>
+          <w:p>
+            <w:pPr>
+              <w:spacing w:after="0"/>
+              <w:jc w:val="center"/>
+            </w:pPr>
+            <w:r>
+              <w:rPr>
+                <w:rFonts w:ascii="Times New Roman"/>
+                <w:b/>
+                <w:bCs/>
+                <w:szCs w:val="28"/>
+                <w:lang w:bidi="ar-EG"/>
+              </w:rPr>
+              <w:t>${</w:t>
+            </w:r>
+            <w:proofErr w:type="spellStart"/>
+            <w:r>
+              <w:rPr>
+                <w:rFonts w:ascii="Times New Roman"/>
+                <w:b/>
+                <w:bCs/>
+                <w:szCs w:val="28"/>
+                <w:lang w:bidi="ar-EG"/>
+              </w:rPr>
+              <w:t>sun_daily</w:t>
+            </w:r>
+            <w:proofErr w:type="spellEnd"/>
+            <w:r>
+              <w:rPr>
+                <w:rFonts w:ascii="Times New Roman"/>
+                <w:b/>
+                <w:bCs/>
+                <w:szCs w:val="28"/>
+                <w:lang w:bidi="ar-EG"/>
+              </w:rPr>
+              <w:t>}</w:t>
+            </w:r>
+          </w:p>
+        </w:tc>
+        <w:tc>
+          <w:tcPr>
+            <w:tcW w:w="1216" w:type="dxa"/>
+          </w:tcPr>
+          <w:p>
+            <w:pPr>
+              <w:spacing w:after="0"/>
+              <w:jc w:val="center"/>
+            </w:pPr>
+            <w:r>
+              <w:rPr>
+                <w:rFonts w:ascii="Times New Roman"/>
+                <w:b/>
+                <w:bCs/>
+                <w:szCs w:val="28"/>
+                <w:lang w:bidi="ar-EG"/>
+              </w:rPr>
+              <w:t>${</w:t>
+            </w:r>
+            <w:proofErr w:type="spellStart"/>
+            <w:r>
+              <w:rPr>
+                <w:rFonts w:ascii="Times New Roman"/>
+                <w:b/>
+                <w:bCs/>
+                <w:szCs w:val="28"/>
+                <w:lang w:bidi="ar-EG"/>
+              </w:rPr>
+              <w:t>sat_daily</w:t>
+            </w:r>
+            <w:proofErr w:type="spellEnd"/>
+            <w:r>
+              <w:rPr>
+                <w:rFonts w:ascii="Times New Roman"/>
+                <w:b/>
+                <w:bCs/>
+                <w:szCs w:val="28"/>
+                <w:lang w:bidi="ar-EG"/>
+              </w:rPr>
+              <w:t>}</w:t>
             </w:r>
           </w:p>
         </w:tc>
@@ -2317,7 +2777,25 @@
                 <w:sz w:val="6"/>
                 <w:szCs w:val="8"/>
               </w:rPr>
-              <w:t>${fri_check_column}</w:t>
+              <w:t>${</w:t>
+            </w:r>
+            <w:proofErr w:type="spellStart"/>
+            <w:r>
+              <w:rPr>
+                <w:rFonts w:ascii="Times New Roman"/>
+                <w:sz w:val="6"/>
+                <w:szCs w:val="8"/>
+              </w:rPr>
+              <w:t>fri_check_column</w:t>
+            </w:r>
+            <w:proofErr w:type="spellEnd"/>
+            <w:r>
+              <w:rPr>
+                <w:rFonts w:ascii="Times New Roman"/>
+                <w:sz w:val="6"/>
+                <w:szCs w:val="8"/>
+              </w:rPr>
+              <w:t>}</w:t>
             </w:r>
           </w:p>
         </w:tc>
@@ -2332,7 +2810,25 @@
                 <w:sz w:val="6"/>
                 <w:szCs w:val="8"/>
               </w:rPr>
-              <w:t>${thu_check_column}</w:t>
+              <w:t>${</w:t>
+            </w:r>
+            <w:proofErr w:type="spellStart"/>
+            <w:r>
+              <w:rPr>
+                <w:rFonts w:ascii="Times New Roman"/>
+                <w:sz w:val="6"/>
+                <w:szCs w:val="8"/>
+              </w:rPr>
+              <w:t>thu_check_column</w:t>
+            </w:r>
+            <w:proofErr w:type="spellEnd"/>
+            <w:r>
+              <w:rPr>
+                <w:rFonts w:ascii="Times New Roman"/>
+                <w:sz w:val="6"/>
+                <w:szCs w:val="8"/>
+              </w:rPr>
+              <w:t>}</w:t>
             </w:r>
           </w:p>
         </w:tc>
@@ -2347,7 +2843,25 @@
                 <w:sz w:val="6"/>
                 <w:szCs w:val="8"/>
               </w:rPr>
-              <w:t>${wed_check_column}</w:t>
+              <w:t>${</w:t>
+            </w:r>
+            <w:proofErr w:type="spellStart"/>
+            <w:r>
+              <w:rPr>
+                <w:rFonts w:ascii="Times New Roman"/>
+                <w:sz w:val="6"/>
+                <w:szCs w:val="8"/>
+              </w:rPr>
+              <w:t>wed_check_column</w:t>
+            </w:r>
+            <w:proofErr w:type="spellEnd"/>
+            <w:r>
+              <w:rPr>
+                <w:rFonts w:ascii="Times New Roman"/>
+                <w:sz w:val="6"/>
+                <w:szCs w:val="8"/>
+              </w:rPr>
+              <w:t>}</w:t>
             </w:r>
           </w:p>
         </w:tc>
@@ -2362,7 +2876,25 @@
                 <w:sz w:val="6"/>
                 <w:szCs w:val="8"/>
               </w:rPr>
-              <w:t>${tue_check_column}</w:t>
+              <w:t>${</w:t>
+            </w:r>
+            <w:proofErr w:type="spellStart"/>
+            <w:r>
+              <w:rPr>
+                <w:rFonts w:ascii="Times New Roman"/>
+                <w:sz w:val="6"/>
+                <w:szCs w:val="8"/>
+              </w:rPr>
+              <w:t>tue_check_column</w:t>
+            </w:r>
+            <w:proofErr w:type="spellEnd"/>
+            <w:r>
+              <w:rPr>
+                <w:rFonts w:ascii="Times New Roman"/>
+                <w:sz w:val="6"/>
+                <w:szCs w:val="8"/>
+              </w:rPr>
+              <w:t>}</w:t>
             </w:r>
           </w:p>
         </w:tc>
@@ -2377,7 +2909,25 @@
                 <w:sz w:val="6"/>
                 <w:szCs w:val="8"/>
               </w:rPr>
-              <w:t>${mon_check_column}</w:t>
+              <w:t>${</w:t>
+            </w:r>
+            <w:proofErr w:type="spellStart"/>
+            <w:r>
+              <w:rPr>
+                <w:rFonts w:ascii="Times New Roman"/>
+                <w:sz w:val="6"/>
+                <w:szCs w:val="8"/>
+              </w:rPr>
+              <w:t>mon_check_column</w:t>
+            </w:r>
+            <w:proofErr w:type="spellEnd"/>
+            <w:r>
+              <w:rPr>
+                <w:rFonts w:ascii="Times New Roman"/>
+                <w:sz w:val="6"/>
+                <w:szCs w:val="8"/>
+              </w:rPr>
+              <w:t>}</w:t>
             </w:r>
           </w:p>
         </w:tc>
@@ -2392,7 +2942,25 @@
                 <w:sz w:val="6"/>
                 <w:szCs w:val="8"/>
               </w:rPr>
-              <w:t>${sun_check_column}</w:t>
+              <w:t>${</w:t>
+            </w:r>
+            <w:proofErr w:type="spellStart"/>
+            <w:r>
+              <w:rPr>
+                <w:rFonts w:ascii="Times New Roman"/>
+                <w:sz w:val="6"/>
+                <w:szCs w:val="8"/>
+              </w:rPr>
+              <w:t>sun_check_column</w:t>
+            </w:r>
+            <w:proofErr w:type="spellEnd"/>
+            <w:r>
+              <w:rPr>
+                <w:rFonts w:ascii="Times New Roman"/>
+                <w:sz w:val="6"/>
+                <w:szCs w:val="8"/>
+              </w:rPr>
+              <w:t>}</w:t>
             </w:r>
           </w:p>
         </w:tc>
@@ -2407,7 +2975,25 @@
                 <w:sz w:val="6"/>
                 <w:szCs w:val="8"/>
               </w:rPr>
-              <w:t>${sat_check_column}</w:t>
+              <w:t>${</w:t>
+            </w:r>
+            <w:proofErr w:type="spellStart"/>
+            <w:r>
+              <w:rPr>
+                <w:rFonts w:ascii="Times New Roman"/>
+                <w:sz w:val="6"/>
+                <w:szCs w:val="8"/>
+              </w:rPr>
+              <w:t>sat_check_column</w:t>
+            </w:r>
+            <w:proofErr w:type="spellEnd"/>
+            <w:r>
+              <w:rPr>
+                <w:rFonts w:ascii="Times New Roman"/>
+                <w:sz w:val="6"/>
+                <w:szCs w:val="8"/>
+              </w:rPr>
+              <w:t>}</w:t>
             </w:r>
           </w:p>
         </w:tc>
@@ -2498,7 +3084,25 @@
                 <w:sz w:val="6"/>
                 <w:szCs w:val="8"/>
               </w:rPr>
-              <w:t>${fri_check_column}</w:t>
+              <w:t>${</w:t>
+            </w:r>
+            <w:proofErr w:type="spellStart"/>
+            <w:r>
+              <w:rPr>
+                <w:rFonts w:ascii="Times New Roman"/>
+                <w:sz w:val="6"/>
+                <w:szCs w:val="8"/>
+              </w:rPr>
+              <w:t>fri_check_column</w:t>
+            </w:r>
+            <w:proofErr w:type="spellEnd"/>
+            <w:r>
+              <w:rPr>
+                <w:rFonts w:ascii="Times New Roman"/>
+                <w:sz w:val="6"/>
+                <w:szCs w:val="8"/>
+              </w:rPr>
+              <w:t>}</w:t>
             </w:r>
           </w:p>
         </w:tc>
@@ -2513,7 +3117,25 @@
                 <w:sz w:val="6"/>
                 <w:szCs w:val="8"/>
               </w:rPr>
-              <w:t>${thu_check_column}</w:t>
+              <w:t>${</w:t>
+            </w:r>
+            <w:proofErr w:type="spellStart"/>
+            <w:r>
+              <w:rPr>
+                <w:rFonts w:ascii="Times New Roman"/>
+                <w:sz w:val="6"/>
+                <w:szCs w:val="8"/>
+              </w:rPr>
+              <w:t>thu_check_column</w:t>
+            </w:r>
+            <w:proofErr w:type="spellEnd"/>
+            <w:r>
+              <w:rPr>
+                <w:rFonts w:ascii="Times New Roman"/>
+                <w:sz w:val="6"/>
+                <w:szCs w:val="8"/>
+              </w:rPr>
+              <w:t>}</w:t>
             </w:r>
           </w:p>
         </w:tc>
@@ -2528,7 +3150,25 @@
                 <w:sz w:val="6"/>
                 <w:szCs w:val="8"/>
               </w:rPr>
-              <w:t>${wed_check_column}</w:t>
+              <w:t>${</w:t>
+            </w:r>
+            <w:proofErr w:type="spellStart"/>
+            <w:r>
+              <w:rPr>
+                <w:rFonts w:ascii="Times New Roman"/>
+                <w:sz w:val="6"/>
+                <w:szCs w:val="8"/>
+              </w:rPr>
+              <w:t>wed_check_column</w:t>
+            </w:r>
+            <w:proofErr w:type="spellEnd"/>
+            <w:r>
+              <w:rPr>
+                <w:rFonts w:ascii="Times New Roman"/>
+                <w:sz w:val="6"/>
+                <w:szCs w:val="8"/>
+              </w:rPr>
+              <w:t>}</w:t>
             </w:r>
           </w:p>
         </w:tc>
@@ -2543,7 +3183,25 @@
                 <w:sz w:val="6"/>
                 <w:szCs w:val="8"/>
               </w:rPr>
-              <w:t>${tue_check_column}</w:t>
+              <w:t>${</w:t>
+            </w:r>
+            <w:proofErr w:type="spellStart"/>
+            <w:r>
+              <w:rPr>
+                <w:rFonts w:ascii="Times New Roman"/>
+                <w:sz w:val="6"/>
+                <w:szCs w:val="8"/>
+              </w:rPr>
+              <w:t>tue_check_column</w:t>
+            </w:r>
+            <w:proofErr w:type="spellEnd"/>
+            <w:r>
+              <w:rPr>
+                <w:rFonts w:ascii="Times New Roman"/>
+                <w:sz w:val="6"/>
+                <w:szCs w:val="8"/>
+              </w:rPr>
+              <w:t>}</w:t>
             </w:r>
           </w:p>
         </w:tc>
@@ -2558,7 +3216,25 @@
                 <w:sz w:val="6"/>
                 <w:szCs w:val="8"/>
               </w:rPr>
-              <w:t>${mon_check_column}</w:t>
+              <w:t>${</w:t>
+            </w:r>
+            <w:proofErr w:type="spellStart"/>
+            <w:r>
+              <w:rPr>
+                <w:rFonts w:ascii="Times New Roman"/>
+                <w:sz w:val="6"/>
+                <w:szCs w:val="8"/>
+              </w:rPr>
+              <w:t>mon_check_column</w:t>
+            </w:r>
+            <w:proofErr w:type="spellEnd"/>
+            <w:r>
+              <w:rPr>
+                <w:rFonts w:ascii="Times New Roman"/>
+                <w:sz w:val="6"/>
+                <w:szCs w:val="8"/>
+              </w:rPr>
+              <w:t>}</w:t>
             </w:r>
           </w:p>
         </w:tc>
@@ -2573,7 +3249,25 @@
                 <w:sz w:val="6"/>
                 <w:szCs w:val="8"/>
               </w:rPr>
-              <w:t>${sun_check_column}</w:t>
+              <w:t>${</w:t>
+            </w:r>
+            <w:proofErr w:type="spellStart"/>
+            <w:r>
+              <w:rPr>
+                <w:rFonts w:ascii="Times New Roman"/>
+                <w:sz w:val="6"/>
+                <w:szCs w:val="8"/>
+              </w:rPr>
+              <w:t>sun_check_column</w:t>
+            </w:r>
+            <w:proofErr w:type="spellEnd"/>
+            <w:r>
+              <w:rPr>
+                <w:rFonts w:ascii="Times New Roman"/>
+                <w:sz w:val="6"/>
+                <w:szCs w:val="8"/>
+              </w:rPr>
+              <w:t>}</w:t>
             </w:r>
           </w:p>
         </w:tc>
@@ -2588,7 +3282,25 @@
                 <w:sz w:val="6"/>
                 <w:szCs w:val="8"/>
               </w:rPr>
-              <w:t>${sat_check_column}</w:t>
+              <w:t>${</w:t>
+            </w:r>
+            <w:proofErr w:type="spellStart"/>
+            <w:r>
+              <w:rPr>
+                <w:rFonts w:ascii="Times New Roman"/>
+                <w:sz w:val="6"/>
+                <w:szCs w:val="8"/>
+              </w:rPr>
+              <w:t>sat_check_column</w:t>
+            </w:r>
+            <w:proofErr w:type="spellEnd"/>
+            <w:r>
+              <w:rPr>
+                <w:rFonts w:ascii="Times New Roman"/>
+                <w:sz w:val="6"/>
+                <w:szCs w:val="8"/>
+              </w:rPr>
+              <w:t>}</w:t>
             </w:r>
           </w:p>
         </w:tc>
@@ -2698,7 +3410,25 @@
                 <w:sz w:val="6"/>
                 <w:szCs w:val="8"/>
               </w:rPr>
-              <w:t>${fri_check_column}</w:t>
+              <w:t>${</w:t>
+            </w:r>
+            <w:proofErr w:type="spellStart"/>
+            <w:r>
+              <w:rPr>
+                <w:rFonts w:ascii="Times New Roman"/>
+                <w:sz w:val="6"/>
+                <w:szCs w:val="8"/>
+              </w:rPr>
+              <w:t>fri_check_column</w:t>
+            </w:r>
+            <w:proofErr w:type="spellEnd"/>
+            <w:r>
+              <w:rPr>
+                <w:rFonts w:ascii="Times New Roman"/>
+                <w:sz w:val="6"/>
+                <w:szCs w:val="8"/>
+              </w:rPr>
+              <w:t>}</w:t>
             </w:r>
           </w:p>
         </w:tc>
@@ -2713,7 +3443,25 @@
                 <w:sz w:val="6"/>
                 <w:szCs w:val="8"/>
               </w:rPr>
-              <w:t>${thu_check_column}</w:t>
+              <w:t>${</w:t>
+            </w:r>
+            <w:proofErr w:type="spellStart"/>
+            <w:r>
+              <w:rPr>
+                <w:rFonts w:ascii="Times New Roman"/>
+                <w:sz w:val="6"/>
+                <w:szCs w:val="8"/>
+              </w:rPr>
+              <w:t>thu_check_column</w:t>
+            </w:r>
+            <w:proofErr w:type="spellEnd"/>
+            <w:r>
+              <w:rPr>
+                <w:rFonts w:ascii="Times New Roman"/>
+                <w:sz w:val="6"/>
+                <w:szCs w:val="8"/>
+              </w:rPr>
+              <w:t>}</w:t>
             </w:r>
           </w:p>
         </w:tc>
@@ -2728,7 +3476,25 @@
                 <w:sz w:val="6"/>
                 <w:szCs w:val="8"/>
               </w:rPr>
-              <w:t>${wed_check_column}</w:t>
+              <w:t>${</w:t>
+            </w:r>
+            <w:proofErr w:type="spellStart"/>
+            <w:r>
+              <w:rPr>
+                <w:rFonts w:ascii="Times New Roman"/>
+                <w:sz w:val="6"/>
+                <w:szCs w:val="8"/>
+              </w:rPr>
+              <w:t>wed_check_column</w:t>
+            </w:r>
+            <w:proofErr w:type="spellEnd"/>
+            <w:r>
+              <w:rPr>
+                <w:rFonts w:ascii="Times New Roman"/>
+                <w:sz w:val="6"/>
+                <w:szCs w:val="8"/>
+              </w:rPr>
+              <w:t>}</w:t>
             </w:r>
           </w:p>
         </w:tc>
@@ -2743,7 +3509,25 @@
                 <w:sz w:val="6"/>
                 <w:szCs w:val="8"/>
               </w:rPr>
-              <w:t>${tue_check_column}</w:t>
+              <w:t>${</w:t>
+            </w:r>
+            <w:proofErr w:type="spellStart"/>
+            <w:r>
+              <w:rPr>
+                <w:rFonts w:ascii="Times New Roman"/>
+                <w:sz w:val="6"/>
+                <w:szCs w:val="8"/>
+              </w:rPr>
+              <w:t>tue_check_column</w:t>
+            </w:r>
+            <w:proofErr w:type="spellEnd"/>
+            <w:r>
+              <w:rPr>
+                <w:rFonts w:ascii="Times New Roman"/>
+                <w:sz w:val="6"/>
+                <w:szCs w:val="8"/>
+              </w:rPr>
+              <w:t>}</w:t>
             </w:r>
           </w:p>
         </w:tc>
@@ -2758,7 +3542,25 @@
                 <w:sz w:val="6"/>
                 <w:szCs w:val="8"/>
               </w:rPr>
-              <w:t>${mon_check_column}</w:t>
+              <w:t>${</w:t>
+            </w:r>
+            <w:proofErr w:type="spellStart"/>
+            <w:r>
+              <w:rPr>
+                <w:rFonts w:ascii="Times New Roman"/>
+                <w:sz w:val="6"/>
+                <w:szCs w:val="8"/>
+              </w:rPr>
+              <w:t>mon_check_column</w:t>
+            </w:r>
+            <w:proofErr w:type="spellEnd"/>
+            <w:r>
+              <w:rPr>
+                <w:rFonts w:ascii="Times New Roman"/>
+                <w:sz w:val="6"/>
+                <w:szCs w:val="8"/>
+              </w:rPr>
+              <w:t>}</w:t>
             </w:r>
           </w:p>
         </w:tc>
@@ -2773,7 +3575,25 @@
                 <w:sz w:val="6"/>
                 <w:szCs w:val="8"/>
               </w:rPr>
-              <w:t>${sun_check_column}</w:t>
+              <w:t>${</w:t>
+            </w:r>
+            <w:proofErr w:type="spellStart"/>
+            <w:r>
+              <w:rPr>
+                <w:rFonts w:ascii="Times New Roman"/>
+                <w:sz w:val="6"/>
+                <w:szCs w:val="8"/>
+              </w:rPr>
+              <w:t>sun_check_column</w:t>
+            </w:r>
+            <w:proofErr w:type="spellEnd"/>
+            <w:r>
+              <w:rPr>
+                <w:rFonts w:ascii="Times New Roman"/>
+                <w:sz w:val="6"/>
+                <w:szCs w:val="8"/>
+              </w:rPr>
+              <w:t>}</w:t>
             </w:r>
           </w:p>
         </w:tc>
@@ -2788,7 +3608,25 @@
                 <w:sz w:val="6"/>
                 <w:szCs w:val="8"/>
               </w:rPr>
-              <w:t>${sat_check_column}</w:t>
+              <w:t>${</w:t>
+            </w:r>
+            <w:proofErr w:type="spellStart"/>
+            <w:r>
+              <w:rPr>
+                <w:rFonts w:ascii="Times New Roman"/>
+                <w:sz w:val="6"/>
+                <w:szCs w:val="8"/>
+              </w:rPr>
+              <w:t>sat_check_column</w:t>
+            </w:r>
+            <w:proofErr w:type="spellEnd"/>
+            <w:r>
+              <w:rPr>
+                <w:rFonts w:ascii="Times New Roman"/>
+                <w:sz w:val="6"/>
+                <w:szCs w:val="8"/>
+              </w:rPr>
+              <w:t>}</w:t>
             </w:r>
           </w:p>
         </w:tc>
@@ -2879,7 +3717,25 @@
                 <w:sz w:val="6"/>
                 <w:szCs w:val="8"/>
               </w:rPr>
-              <w:t>${fri_check_column}</w:t>
+              <w:t>${</w:t>
+            </w:r>
+            <w:proofErr w:type="spellStart"/>
+            <w:r>
+              <w:rPr>
+                <w:rFonts w:ascii="Times New Roman"/>
+                <w:sz w:val="6"/>
+                <w:szCs w:val="8"/>
+              </w:rPr>
+              <w:t>fri_check_column</w:t>
+            </w:r>
+            <w:proofErr w:type="spellEnd"/>
+            <w:r>
+              <w:rPr>
+                <w:rFonts w:ascii="Times New Roman"/>
+                <w:sz w:val="6"/>
+                <w:szCs w:val="8"/>
+              </w:rPr>
+              <w:t>}</w:t>
             </w:r>
           </w:p>
         </w:tc>
@@ -2894,7 +3750,25 @@
                 <w:sz w:val="6"/>
                 <w:szCs w:val="8"/>
               </w:rPr>
-              <w:t>${thu_check_column}</w:t>
+              <w:t>${</w:t>
+            </w:r>
+            <w:proofErr w:type="spellStart"/>
+            <w:r>
+              <w:rPr>
+                <w:rFonts w:ascii="Times New Roman"/>
+                <w:sz w:val="6"/>
+                <w:szCs w:val="8"/>
+              </w:rPr>
+              <w:t>thu_check_column</w:t>
+            </w:r>
+            <w:proofErr w:type="spellEnd"/>
+            <w:r>
+              <w:rPr>
+                <w:rFonts w:ascii="Times New Roman"/>
+                <w:sz w:val="6"/>
+                <w:szCs w:val="8"/>
+              </w:rPr>
+              <w:t>}</w:t>
             </w:r>
           </w:p>
         </w:tc>
@@ -2909,7 +3783,25 @@
                 <w:sz w:val="6"/>
                 <w:szCs w:val="8"/>
               </w:rPr>
-              <w:t>${wed_check_column}</w:t>
+              <w:t>${</w:t>
+            </w:r>
+            <w:proofErr w:type="spellStart"/>
+            <w:r>
+              <w:rPr>
+                <w:rFonts w:ascii="Times New Roman"/>
+                <w:sz w:val="6"/>
+                <w:szCs w:val="8"/>
+              </w:rPr>
+              <w:t>wed_check_column</w:t>
+            </w:r>
+            <w:proofErr w:type="spellEnd"/>
+            <w:r>
+              <w:rPr>
+                <w:rFonts w:ascii="Times New Roman"/>
+                <w:sz w:val="6"/>
+                <w:szCs w:val="8"/>
+              </w:rPr>
+              <w:t>}</w:t>
             </w:r>
           </w:p>
         </w:tc>
@@ -2924,7 +3816,25 @@
                 <w:sz w:val="6"/>
                 <w:szCs w:val="8"/>
               </w:rPr>
-              <w:t>${tue_check_column}</w:t>
+              <w:t>${</w:t>
+            </w:r>
+            <w:proofErr w:type="spellStart"/>
+            <w:r>
+              <w:rPr>
+                <w:rFonts w:ascii="Times New Roman"/>
+                <w:sz w:val="6"/>
+                <w:szCs w:val="8"/>
+              </w:rPr>
+              <w:t>tue_check_column</w:t>
+            </w:r>
+            <w:proofErr w:type="spellEnd"/>
+            <w:r>
+              <w:rPr>
+                <w:rFonts w:ascii="Times New Roman"/>
+                <w:sz w:val="6"/>
+                <w:szCs w:val="8"/>
+              </w:rPr>
+              <w:t>}</w:t>
             </w:r>
           </w:p>
         </w:tc>
@@ -2939,7 +3849,25 @@
                 <w:sz w:val="6"/>
                 <w:szCs w:val="8"/>
               </w:rPr>
-              <w:t>${mon_check_column}</w:t>
+              <w:t>${</w:t>
+            </w:r>
+            <w:proofErr w:type="spellStart"/>
+            <w:r>
+              <w:rPr>
+                <w:rFonts w:ascii="Times New Roman"/>
+                <w:sz w:val="6"/>
+                <w:szCs w:val="8"/>
+              </w:rPr>
+              <w:t>mon_check_column</w:t>
+            </w:r>
+            <w:proofErr w:type="spellEnd"/>
+            <w:r>
+              <w:rPr>
+                <w:rFonts w:ascii="Times New Roman"/>
+                <w:sz w:val="6"/>
+                <w:szCs w:val="8"/>
+              </w:rPr>
+              <w:t>}</w:t>
             </w:r>
           </w:p>
         </w:tc>
@@ -2954,7 +3882,25 @@
                 <w:sz w:val="6"/>
                 <w:szCs w:val="8"/>
               </w:rPr>
-              <w:t>${sun_check_column}</w:t>
+              <w:t>${</w:t>
+            </w:r>
+            <w:proofErr w:type="spellStart"/>
+            <w:r>
+              <w:rPr>
+                <w:rFonts w:ascii="Times New Roman"/>
+                <w:sz w:val="6"/>
+                <w:szCs w:val="8"/>
+              </w:rPr>
+              <w:t>sun_check_column</w:t>
+            </w:r>
+            <w:proofErr w:type="spellEnd"/>
+            <w:r>
+              <w:rPr>
+                <w:rFonts w:ascii="Times New Roman"/>
+                <w:sz w:val="6"/>
+                <w:szCs w:val="8"/>
+              </w:rPr>
+              <w:t>}</w:t>
             </w:r>
           </w:p>
         </w:tc>
@@ -2969,7 +3915,25 @@
                 <w:sz w:val="6"/>
                 <w:szCs w:val="8"/>
               </w:rPr>
-              <w:t>${sat_check_column}</w:t>
+              <w:t>${</w:t>
+            </w:r>
+            <w:proofErr w:type="spellStart"/>
+            <w:r>
+              <w:rPr>
+                <w:rFonts w:ascii="Times New Roman"/>
+                <w:sz w:val="6"/>
+                <w:szCs w:val="8"/>
+              </w:rPr>
+              <w:t>sat_check_column</w:t>
+            </w:r>
+            <w:proofErr w:type="spellEnd"/>
+            <w:r>
+              <w:rPr>
+                <w:rFonts w:ascii="Times New Roman"/>
+                <w:sz w:val="6"/>
+                <w:szCs w:val="8"/>
+              </w:rPr>
+              <w:t>}</w:t>
             </w:r>
           </w:p>
         </w:tc>
@@ -3060,7 +4024,25 @@
                 <w:sz w:val="6"/>
                 <w:szCs w:val="8"/>
               </w:rPr>
-              <w:t>${fri_check_column}</w:t>
+              <w:t>${</w:t>
+            </w:r>
+            <w:proofErr w:type="spellStart"/>
+            <w:r>
+              <w:rPr>
+                <w:rFonts w:ascii="Times New Roman"/>
+                <w:sz w:val="6"/>
+                <w:szCs w:val="8"/>
+              </w:rPr>
+              <w:t>fri_check_column</w:t>
+            </w:r>
+            <w:proofErr w:type="spellEnd"/>
+            <w:r>
+              <w:rPr>
+                <w:rFonts w:ascii="Times New Roman"/>
+                <w:sz w:val="6"/>
+                <w:szCs w:val="8"/>
+              </w:rPr>
+              <w:t>}</w:t>
             </w:r>
           </w:p>
         </w:tc>
@@ -3075,7 +4057,25 @@
                 <w:sz w:val="6"/>
                 <w:szCs w:val="8"/>
               </w:rPr>
-              <w:t>${thu_check_column}</w:t>
+              <w:t>${</w:t>
+            </w:r>
+            <w:proofErr w:type="spellStart"/>
+            <w:r>
+              <w:rPr>
+                <w:rFonts w:ascii="Times New Roman"/>
+                <w:sz w:val="6"/>
+                <w:szCs w:val="8"/>
+              </w:rPr>
+              <w:t>thu_check_column</w:t>
+            </w:r>
+            <w:proofErr w:type="spellEnd"/>
+            <w:r>
+              <w:rPr>
+                <w:rFonts w:ascii="Times New Roman"/>
+                <w:sz w:val="6"/>
+                <w:szCs w:val="8"/>
+              </w:rPr>
+              <w:t>}</w:t>
             </w:r>
           </w:p>
         </w:tc>
@@ -3090,7 +4090,25 @@
                 <w:sz w:val="6"/>
                 <w:szCs w:val="8"/>
               </w:rPr>
-              <w:t>${wed_check_column}</w:t>
+              <w:t>${</w:t>
+            </w:r>
+            <w:proofErr w:type="spellStart"/>
+            <w:r>
+              <w:rPr>
+                <w:rFonts w:ascii="Times New Roman"/>
+                <w:sz w:val="6"/>
+                <w:szCs w:val="8"/>
+              </w:rPr>
+              <w:t>wed_check_column</w:t>
+            </w:r>
+            <w:proofErr w:type="spellEnd"/>
+            <w:r>
+              <w:rPr>
+                <w:rFonts w:ascii="Times New Roman"/>
+                <w:sz w:val="6"/>
+                <w:szCs w:val="8"/>
+              </w:rPr>
+              <w:t>}</w:t>
             </w:r>
           </w:p>
         </w:tc>
@@ -3105,7 +4123,25 @@
                 <w:sz w:val="6"/>
                 <w:szCs w:val="8"/>
               </w:rPr>
-              <w:t>${tue_check_column}</w:t>
+              <w:t>${</w:t>
+            </w:r>
+            <w:proofErr w:type="spellStart"/>
+            <w:r>
+              <w:rPr>
+                <w:rFonts w:ascii="Times New Roman"/>
+                <w:sz w:val="6"/>
+                <w:szCs w:val="8"/>
+              </w:rPr>
+              <w:t>tue_check_column</w:t>
+            </w:r>
+            <w:proofErr w:type="spellEnd"/>
+            <w:r>
+              <w:rPr>
+                <w:rFonts w:ascii="Times New Roman"/>
+                <w:sz w:val="6"/>
+                <w:szCs w:val="8"/>
+              </w:rPr>
+              <w:t>}</w:t>
             </w:r>
           </w:p>
         </w:tc>
@@ -3120,7 +4156,25 @@
                 <w:sz w:val="6"/>
                 <w:szCs w:val="8"/>
               </w:rPr>
-              <w:t>${mon_check_column}</w:t>
+              <w:t>${</w:t>
+            </w:r>
+            <w:proofErr w:type="spellStart"/>
+            <w:r>
+              <w:rPr>
+                <w:rFonts w:ascii="Times New Roman"/>
+                <w:sz w:val="6"/>
+                <w:szCs w:val="8"/>
+              </w:rPr>
+              <w:t>mon_check_column</w:t>
+            </w:r>
+            <w:proofErr w:type="spellEnd"/>
+            <w:r>
+              <w:rPr>
+                <w:rFonts w:ascii="Times New Roman"/>
+                <w:sz w:val="6"/>
+                <w:szCs w:val="8"/>
+              </w:rPr>
+              <w:t>}</w:t>
             </w:r>
           </w:p>
         </w:tc>
@@ -3135,7 +4189,25 @@
                 <w:sz w:val="6"/>
                 <w:szCs w:val="8"/>
               </w:rPr>
-              <w:t>${sun_check_column}</w:t>
+              <w:t>${</w:t>
+            </w:r>
+            <w:proofErr w:type="spellStart"/>
+            <w:r>
+              <w:rPr>
+                <w:rFonts w:ascii="Times New Roman"/>
+                <w:sz w:val="6"/>
+                <w:szCs w:val="8"/>
+              </w:rPr>
+              <w:t>sun_check_column</w:t>
+            </w:r>
+            <w:proofErr w:type="spellEnd"/>
+            <w:r>
+              <w:rPr>
+                <w:rFonts w:ascii="Times New Roman"/>
+                <w:sz w:val="6"/>
+                <w:szCs w:val="8"/>
+              </w:rPr>
+              <w:t>}</w:t>
             </w:r>
           </w:p>
         </w:tc>
@@ -3150,7 +4222,25 @@
                 <w:sz w:val="6"/>
                 <w:szCs w:val="8"/>
               </w:rPr>
-              <w:t>${sat_check_column}</w:t>
+              <w:t>${</w:t>
+            </w:r>
+            <w:proofErr w:type="spellStart"/>
+            <w:r>
+              <w:rPr>
+                <w:rFonts w:ascii="Times New Roman"/>
+                <w:sz w:val="6"/>
+                <w:szCs w:val="8"/>
+              </w:rPr>
+              <w:t>sat_check_column</w:t>
+            </w:r>
+            <w:proofErr w:type="spellEnd"/>
+            <w:r>
+              <w:rPr>
+                <w:rFonts w:ascii="Times New Roman"/>
+                <w:sz w:val="6"/>
+                <w:szCs w:val="8"/>
+              </w:rPr>
+              <w:t>}</w:t>
             </w:r>
           </w:p>
         </w:tc>
@@ -3241,7 +4331,25 @@
                 <w:sz w:val="6"/>
                 <w:szCs w:val="8"/>
               </w:rPr>
-              <w:t>${fri_check_column}</w:t>
+              <w:t>${</w:t>
+            </w:r>
+            <w:proofErr w:type="spellStart"/>
+            <w:r>
+              <w:rPr>
+                <w:rFonts w:ascii="Times New Roman"/>
+                <w:sz w:val="6"/>
+                <w:szCs w:val="8"/>
+              </w:rPr>
+              <w:t>fri_check_column</w:t>
+            </w:r>
+            <w:proofErr w:type="spellEnd"/>
+            <w:r>
+              <w:rPr>
+                <w:rFonts w:ascii="Times New Roman"/>
+                <w:sz w:val="6"/>
+                <w:szCs w:val="8"/>
+              </w:rPr>
+              <w:t>}</w:t>
             </w:r>
           </w:p>
         </w:tc>
@@ -3256,7 +4364,25 @@
                 <w:sz w:val="6"/>
                 <w:szCs w:val="8"/>
               </w:rPr>
-              <w:t>${thu_check_column}</w:t>
+              <w:t>${</w:t>
+            </w:r>
+            <w:proofErr w:type="spellStart"/>
+            <w:r>
+              <w:rPr>
+                <w:rFonts w:ascii="Times New Roman"/>
+                <w:sz w:val="6"/>
+                <w:szCs w:val="8"/>
+              </w:rPr>
+              <w:t>thu_check_column</w:t>
+            </w:r>
+            <w:proofErr w:type="spellEnd"/>
+            <w:r>
+              <w:rPr>
+                <w:rFonts w:ascii="Times New Roman"/>
+                <w:sz w:val="6"/>
+                <w:szCs w:val="8"/>
+              </w:rPr>
+              <w:t>}</w:t>
             </w:r>
           </w:p>
         </w:tc>
@@ -3271,7 +4397,25 @@
                 <w:sz w:val="6"/>
                 <w:szCs w:val="8"/>
               </w:rPr>
-              <w:t>${wed_check_column}</w:t>
+              <w:t>${</w:t>
+            </w:r>
+            <w:proofErr w:type="spellStart"/>
+            <w:r>
+              <w:rPr>
+                <w:rFonts w:ascii="Times New Roman"/>
+                <w:sz w:val="6"/>
+                <w:szCs w:val="8"/>
+              </w:rPr>
+              <w:t>wed_check_column</w:t>
+            </w:r>
+            <w:proofErr w:type="spellEnd"/>
+            <w:r>
+              <w:rPr>
+                <w:rFonts w:ascii="Times New Roman"/>
+                <w:sz w:val="6"/>
+                <w:szCs w:val="8"/>
+              </w:rPr>
+              <w:t>}</w:t>
             </w:r>
           </w:p>
         </w:tc>
@@ -3286,7 +4430,25 @@
                 <w:sz w:val="6"/>
                 <w:szCs w:val="8"/>
               </w:rPr>
-              <w:t>${tue_check_column}</w:t>
+              <w:t>${</w:t>
+            </w:r>
+            <w:proofErr w:type="spellStart"/>
+            <w:r>
+              <w:rPr>
+                <w:rFonts w:ascii="Times New Roman"/>
+                <w:sz w:val="6"/>
+                <w:szCs w:val="8"/>
+              </w:rPr>
+              <w:t>tue_check_column</w:t>
+            </w:r>
+            <w:proofErr w:type="spellEnd"/>
+            <w:r>
+              <w:rPr>
+                <w:rFonts w:ascii="Times New Roman"/>
+                <w:sz w:val="6"/>
+                <w:szCs w:val="8"/>
+              </w:rPr>
+              <w:t>}</w:t>
             </w:r>
           </w:p>
         </w:tc>
@@ -3301,7 +4463,25 @@
                 <w:sz w:val="6"/>
                 <w:szCs w:val="8"/>
               </w:rPr>
-              <w:t>${mon_check_column}</w:t>
+              <w:t>${</w:t>
+            </w:r>
+            <w:proofErr w:type="spellStart"/>
+            <w:r>
+              <w:rPr>
+                <w:rFonts w:ascii="Times New Roman"/>
+                <w:sz w:val="6"/>
+                <w:szCs w:val="8"/>
+              </w:rPr>
+              <w:t>mon_check_column</w:t>
+            </w:r>
+            <w:proofErr w:type="spellEnd"/>
+            <w:r>
+              <w:rPr>
+                <w:rFonts w:ascii="Times New Roman"/>
+                <w:sz w:val="6"/>
+                <w:szCs w:val="8"/>
+              </w:rPr>
+              <w:t>}</w:t>
             </w:r>
           </w:p>
         </w:tc>
@@ -3316,7 +4496,25 @@
                 <w:sz w:val="6"/>
                 <w:szCs w:val="8"/>
               </w:rPr>
-              <w:t>${sun_check_column}</w:t>
+              <w:t>${</w:t>
+            </w:r>
+            <w:proofErr w:type="spellStart"/>
+            <w:r>
+              <w:rPr>
+                <w:rFonts w:ascii="Times New Roman"/>
+                <w:sz w:val="6"/>
+                <w:szCs w:val="8"/>
+              </w:rPr>
+              <w:t>sun_check_column</w:t>
+            </w:r>
+            <w:proofErr w:type="spellEnd"/>
+            <w:r>
+              <w:rPr>
+                <w:rFonts w:ascii="Times New Roman"/>
+                <w:sz w:val="6"/>
+                <w:szCs w:val="8"/>
+              </w:rPr>
+              <w:t>}</w:t>
             </w:r>
           </w:p>
         </w:tc>
@@ -3331,7 +4529,25 @@
                 <w:sz w:val="6"/>
                 <w:szCs w:val="8"/>
               </w:rPr>
-              <w:t>${sat_check_column}</w:t>
+              <w:t>${</w:t>
+            </w:r>
+            <w:proofErr w:type="spellStart"/>
+            <w:r>
+              <w:rPr>
+                <w:rFonts w:ascii="Times New Roman"/>
+                <w:sz w:val="6"/>
+                <w:szCs w:val="8"/>
+              </w:rPr>
+              <w:t>sat_check_column</w:t>
+            </w:r>
+            <w:proofErr w:type="spellEnd"/>
+            <w:r>
+              <w:rPr>
+                <w:rFonts w:ascii="Times New Roman"/>
+                <w:sz w:val="6"/>
+                <w:szCs w:val="8"/>
+              </w:rPr>
+              <w:t>}</w:t>
             </w:r>
           </w:p>
         </w:tc>
@@ -3431,7 +4647,25 @@
                 <w:sz w:val="6"/>
                 <w:szCs w:val="8"/>
               </w:rPr>
-              <w:t>${fri_check_column}</w:t>
+              <w:t>${</w:t>
+            </w:r>
+            <w:proofErr w:type="spellStart"/>
+            <w:r>
+              <w:rPr>
+                <w:rFonts w:ascii="Times New Roman"/>
+                <w:sz w:val="6"/>
+                <w:szCs w:val="8"/>
+              </w:rPr>
+              <w:t>fri_check_column</w:t>
+            </w:r>
+            <w:proofErr w:type="spellEnd"/>
+            <w:r>
+              <w:rPr>
+                <w:rFonts w:ascii="Times New Roman"/>
+                <w:sz w:val="6"/>
+                <w:szCs w:val="8"/>
+              </w:rPr>
+              <w:t>}</w:t>
             </w:r>
           </w:p>
         </w:tc>
@@ -3446,7 +4680,25 @@
                 <w:sz w:val="6"/>
                 <w:szCs w:val="8"/>
               </w:rPr>
-              <w:t>${thu_check_column}</w:t>
+              <w:t>${</w:t>
+            </w:r>
+            <w:proofErr w:type="spellStart"/>
+            <w:r>
+              <w:rPr>
+                <w:rFonts w:ascii="Times New Roman"/>
+                <w:sz w:val="6"/>
+                <w:szCs w:val="8"/>
+              </w:rPr>
+              <w:t>thu_check_column</w:t>
+            </w:r>
+            <w:proofErr w:type="spellEnd"/>
+            <w:r>
+              <w:rPr>
+                <w:rFonts w:ascii="Times New Roman"/>
+                <w:sz w:val="6"/>
+                <w:szCs w:val="8"/>
+              </w:rPr>
+              <w:t>}</w:t>
             </w:r>
           </w:p>
         </w:tc>
@@ -3461,7 +4713,25 @@
                 <w:sz w:val="6"/>
                 <w:szCs w:val="8"/>
               </w:rPr>
-              <w:t>${wed_check_column}</w:t>
+              <w:t>${</w:t>
+            </w:r>
+            <w:proofErr w:type="spellStart"/>
+            <w:r>
+              <w:rPr>
+                <w:rFonts w:ascii="Times New Roman"/>
+                <w:sz w:val="6"/>
+                <w:szCs w:val="8"/>
+              </w:rPr>
+              <w:t>wed_check_column</w:t>
+            </w:r>
+            <w:proofErr w:type="spellEnd"/>
+            <w:r>
+              <w:rPr>
+                <w:rFonts w:ascii="Times New Roman"/>
+                <w:sz w:val="6"/>
+                <w:szCs w:val="8"/>
+              </w:rPr>
+              <w:t>}</w:t>
             </w:r>
           </w:p>
         </w:tc>
@@ -3476,7 +4746,25 @@
                 <w:sz w:val="6"/>
                 <w:szCs w:val="8"/>
               </w:rPr>
-              <w:t>${tue_check_column}</w:t>
+              <w:t>${</w:t>
+            </w:r>
+            <w:proofErr w:type="spellStart"/>
+            <w:r>
+              <w:rPr>
+                <w:rFonts w:ascii="Times New Roman"/>
+                <w:sz w:val="6"/>
+                <w:szCs w:val="8"/>
+              </w:rPr>
+              <w:t>tue_check_column</w:t>
+            </w:r>
+            <w:proofErr w:type="spellEnd"/>
+            <w:r>
+              <w:rPr>
+                <w:rFonts w:ascii="Times New Roman"/>
+                <w:sz w:val="6"/>
+                <w:szCs w:val="8"/>
+              </w:rPr>
+              <w:t>}</w:t>
             </w:r>
           </w:p>
         </w:tc>
@@ -3491,7 +4779,25 @@
                 <w:sz w:val="6"/>
                 <w:szCs w:val="8"/>
               </w:rPr>
-              <w:t>${mon_check_column}</w:t>
+              <w:t>${</w:t>
+            </w:r>
+            <w:proofErr w:type="spellStart"/>
+            <w:r>
+              <w:rPr>
+                <w:rFonts w:ascii="Times New Roman"/>
+                <w:sz w:val="6"/>
+                <w:szCs w:val="8"/>
+              </w:rPr>
+              <w:t>mon_check_column</w:t>
+            </w:r>
+            <w:proofErr w:type="spellEnd"/>
+            <w:r>
+              <w:rPr>
+                <w:rFonts w:ascii="Times New Roman"/>
+                <w:sz w:val="6"/>
+                <w:szCs w:val="8"/>
+              </w:rPr>
+              <w:t>}</w:t>
             </w:r>
           </w:p>
         </w:tc>
@@ -3506,7 +4812,25 @@
                 <w:sz w:val="6"/>
                 <w:szCs w:val="8"/>
               </w:rPr>
-              <w:t>${sun_check_column}</w:t>
+              <w:t>${</w:t>
+            </w:r>
+            <w:proofErr w:type="spellStart"/>
+            <w:r>
+              <w:rPr>
+                <w:rFonts w:ascii="Times New Roman"/>
+                <w:sz w:val="6"/>
+                <w:szCs w:val="8"/>
+              </w:rPr>
+              <w:t>sun_check_column</w:t>
+            </w:r>
+            <w:proofErr w:type="spellEnd"/>
+            <w:r>
+              <w:rPr>
+                <w:rFonts w:ascii="Times New Roman"/>
+                <w:sz w:val="6"/>
+                <w:szCs w:val="8"/>
+              </w:rPr>
+              <w:t>}</w:t>
             </w:r>
           </w:p>
         </w:tc>
@@ -3521,7 +4845,25 @@
                 <w:sz w:val="6"/>
                 <w:szCs w:val="8"/>
               </w:rPr>
-              <w:t>${sat_check_column}</w:t>
+              <w:t>${</w:t>
+            </w:r>
+            <w:proofErr w:type="spellStart"/>
+            <w:r>
+              <w:rPr>
+                <w:rFonts w:ascii="Times New Roman"/>
+                <w:sz w:val="6"/>
+                <w:szCs w:val="8"/>
+              </w:rPr>
+              <w:t>sat_check_column</w:t>
+            </w:r>
+            <w:proofErr w:type="spellEnd"/>
+            <w:r>
+              <w:rPr>
+                <w:rFonts w:ascii="Times New Roman"/>
+                <w:sz w:val="6"/>
+                <w:szCs w:val="8"/>
+              </w:rPr>
+              <w:t>}</w:t>
             </w:r>
           </w:p>
         </w:tc>
@@ -3612,7 +4954,25 @@
                 <w:sz w:val="6"/>
                 <w:szCs w:val="8"/>
               </w:rPr>
-              <w:t>${fri_check_column}</w:t>
+              <w:t>${</w:t>
+            </w:r>
+            <w:proofErr w:type="spellStart"/>
+            <w:r>
+              <w:rPr>
+                <w:rFonts w:ascii="Times New Roman"/>
+                <w:sz w:val="6"/>
+                <w:szCs w:val="8"/>
+              </w:rPr>
+              <w:t>fri_check_column</w:t>
+            </w:r>
+            <w:proofErr w:type="spellEnd"/>
+            <w:r>
+              <w:rPr>
+                <w:rFonts w:ascii="Times New Roman"/>
+                <w:sz w:val="6"/>
+                <w:szCs w:val="8"/>
+              </w:rPr>
+              <w:t>}</w:t>
             </w:r>
           </w:p>
         </w:tc>
@@ -3627,7 +4987,25 @@
                 <w:sz w:val="6"/>
                 <w:szCs w:val="8"/>
               </w:rPr>
-              <w:t>${thu_check_column}</w:t>
+              <w:t>${</w:t>
+            </w:r>
+            <w:proofErr w:type="spellStart"/>
+            <w:r>
+              <w:rPr>
+                <w:rFonts w:ascii="Times New Roman"/>
+                <w:sz w:val="6"/>
+                <w:szCs w:val="8"/>
+              </w:rPr>
+              <w:t>thu_check_column</w:t>
+            </w:r>
+            <w:proofErr w:type="spellEnd"/>
+            <w:r>
+              <w:rPr>
+                <w:rFonts w:ascii="Times New Roman"/>
+                <w:sz w:val="6"/>
+                <w:szCs w:val="8"/>
+              </w:rPr>
+              <w:t>}</w:t>
             </w:r>
           </w:p>
         </w:tc>
@@ -3642,7 +5020,25 @@
                 <w:sz w:val="6"/>
                 <w:szCs w:val="8"/>
               </w:rPr>
-              <w:t>${wed_check_column}</w:t>
+              <w:t>${</w:t>
+            </w:r>
+            <w:proofErr w:type="spellStart"/>
+            <w:r>
+              <w:rPr>
+                <w:rFonts w:ascii="Times New Roman"/>
+                <w:sz w:val="6"/>
+                <w:szCs w:val="8"/>
+              </w:rPr>
+              <w:t>wed_check_column</w:t>
+            </w:r>
+            <w:proofErr w:type="spellEnd"/>
+            <w:r>
+              <w:rPr>
+                <w:rFonts w:ascii="Times New Roman"/>
+                <w:sz w:val="6"/>
+                <w:szCs w:val="8"/>
+              </w:rPr>
+              <w:t>}</w:t>
             </w:r>
           </w:p>
         </w:tc>
@@ -3657,7 +5053,25 @@
                 <w:sz w:val="6"/>
                 <w:szCs w:val="8"/>
               </w:rPr>
-              <w:t>${tue_check_column}</w:t>
+              <w:t>${</w:t>
+            </w:r>
+            <w:proofErr w:type="spellStart"/>
+            <w:r>
+              <w:rPr>
+                <w:rFonts w:ascii="Times New Roman"/>
+                <w:sz w:val="6"/>
+                <w:szCs w:val="8"/>
+              </w:rPr>
+              <w:t>tue_check_column</w:t>
+            </w:r>
+            <w:proofErr w:type="spellEnd"/>
+            <w:r>
+              <w:rPr>
+                <w:rFonts w:ascii="Times New Roman"/>
+                <w:sz w:val="6"/>
+                <w:szCs w:val="8"/>
+              </w:rPr>
+              <w:t>}</w:t>
             </w:r>
           </w:p>
         </w:tc>
@@ -3672,7 +5086,25 @@
                 <w:sz w:val="6"/>
                 <w:szCs w:val="8"/>
               </w:rPr>
-              <w:t>${mon_check_column}</w:t>
+              <w:t>${</w:t>
+            </w:r>
+            <w:proofErr w:type="spellStart"/>
+            <w:r>
+              <w:rPr>
+                <w:rFonts w:ascii="Times New Roman"/>
+                <w:sz w:val="6"/>
+                <w:szCs w:val="8"/>
+              </w:rPr>
+              <w:t>mon_check_column</w:t>
+            </w:r>
+            <w:proofErr w:type="spellEnd"/>
+            <w:r>
+              <w:rPr>
+                <w:rFonts w:ascii="Times New Roman"/>
+                <w:sz w:val="6"/>
+                <w:szCs w:val="8"/>
+              </w:rPr>
+              <w:t>}</w:t>
             </w:r>
           </w:p>
         </w:tc>
@@ -3687,7 +5119,25 @@
                 <w:sz w:val="6"/>
                 <w:szCs w:val="8"/>
               </w:rPr>
-              <w:t>${sun_check_column}</w:t>
+              <w:t>${</w:t>
+            </w:r>
+            <w:proofErr w:type="spellStart"/>
+            <w:r>
+              <w:rPr>
+                <w:rFonts w:ascii="Times New Roman"/>
+                <w:sz w:val="6"/>
+                <w:szCs w:val="8"/>
+              </w:rPr>
+              <w:t>sun_check_column</w:t>
+            </w:r>
+            <w:proofErr w:type="spellEnd"/>
+            <w:r>
+              <w:rPr>
+                <w:rFonts w:ascii="Times New Roman"/>
+                <w:sz w:val="6"/>
+                <w:szCs w:val="8"/>
+              </w:rPr>
+              <w:t>}</w:t>
             </w:r>
           </w:p>
         </w:tc>
@@ -3702,7 +5152,25 @@
                 <w:sz w:val="6"/>
                 <w:szCs w:val="8"/>
               </w:rPr>
-              <w:t>${sat_check_column}</w:t>
+              <w:t>${</w:t>
+            </w:r>
+            <w:proofErr w:type="spellStart"/>
+            <w:r>
+              <w:rPr>
+                <w:rFonts w:ascii="Times New Roman"/>
+                <w:sz w:val="6"/>
+                <w:szCs w:val="8"/>
+              </w:rPr>
+              <w:t>sat_check_column</w:t>
+            </w:r>
+            <w:proofErr w:type="spellEnd"/>
+            <w:r>
+              <w:rPr>
+                <w:rFonts w:ascii="Times New Roman"/>
+                <w:sz w:val="6"/>
+                <w:szCs w:val="8"/>
+              </w:rPr>
+              <w:t>}</w:t>
             </w:r>
           </w:p>
         </w:tc>
@@ -3783,7 +5251,25 @@
                 <w:sz w:val="6"/>
                 <w:szCs w:val="8"/>
               </w:rPr>
-              <w:t>${fri_check_column}</w:t>
+              <w:t>${</w:t>
+            </w:r>
+            <w:proofErr w:type="spellStart"/>
+            <w:r>
+              <w:rPr>
+                <w:rFonts w:ascii="Times New Roman"/>
+                <w:sz w:val="6"/>
+                <w:szCs w:val="8"/>
+              </w:rPr>
+              <w:t>fri_check_column</w:t>
+            </w:r>
+            <w:proofErr w:type="spellEnd"/>
+            <w:r>
+              <w:rPr>
+                <w:rFonts w:ascii="Times New Roman"/>
+                <w:sz w:val="6"/>
+                <w:szCs w:val="8"/>
+              </w:rPr>
+              <w:t>}</w:t>
             </w:r>
           </w:p>
         </w:tc>
@@ -3798,7 +5284,25 @@
                 <w:sz w:val="6"/>
                 <w:szCs w:val="8"/>
               </w:rPr>
-              <w:t>${thu_check_column}</w:t>
+              <w:t>${</w:t>
+            </w:r>
+            <w:proofErr w:type="spellStart"/>
+            <w:r>
+              <w:rPr>
+                <w:rFonts w:ascii="Times New Roman"/>
+                <w:sz w:val="6"/>
+                <w:szCs w:val="8"/>
+              </w:rPr>
+              <w:t>thu_check_column</w:t>
+            </w:r>
+            <w:proofErr w:type="spellEnd"/>
+            <w:r>
+              <w:rPr>
+                <w:rFonts w:ascii="Times New Roman"/>
+                <w:sz w:val="6"/>
+                <w:szCs w:val="8"/>
+              </w:rPr>
+              <w:t>}</w:t>
             </w:r>
           </w:p>
         </w:tc>
@@ -3813,7 +5317,25 @@
                 <w:sz w:val="6"/>
                 <w:szCs w:val="8"/>
               </w:rPr>
-              <w:t>${wed_check_column}</w:t>
+              <w:t>${</w:t>
+            </w:r>
+            <w:proofErr w:type="spellStart"/>
+            <w:r>
+              <w:rPr>
+                <w:rFonts w:ascii="Times New Roman"/>
+                <w:sz w:val="6"/>
+                <w:szCs w:val="8"/>
+              </w:rPr>
+              <w:t>wed_check_column</w:t>
+            </w:r>
+            <w:proofErr w:type="spellEnd"/>
+            <w:r>
+              <w:rPr>
+                <w:rFonts w:ascii="Times New Roman"/>
+                <w:sz w:val="6"/>
+                <w:szCs w:val="8"/>
+              </w:rPr>
+              <w:t>}</w:t>
             </w:r>
           </w:p>
         </w:tc>
@@ -3828,7 +5350,25 @@
                 <w:sz w:val="6"/>
                 <w:szCs w:val="8"/>
               </w:rPr>
-              <w:t>${tue_check_column}</w:t>
+              <w:t>${</w:t>
+            </w:r>
+            <w:proofErr w:type="spellStart"/>
+            <w:r>
+              <w:rPr>
+                <w:rFonts w:ascii="Times New Roman"/>
+                <w:sz w:val="6"/>
+                <w:szCs w:val="8"/>
+              </w:rPr>
+              <w:t>tue_check_column</w:t>
+            </w:r>
+            <w:proofErr w:type="spellEnd"/>
+            <w:r>
+              <w:rPr>
+                <w:rFonts w:ascii="Times New Roman"/>
+                <w:sz w:val="6"/>
+                <w:szCs w:val="8"/>
+              </w:rPr>
+              <w:t>}</w:t>
             </w:r>
           </w:p>
         </w:tc>
@@ -3843,7 +5383,25 @@
                 <w:sz w:val="6"/>
                 <w:szCs w:val="8"/>
               </w:rPr>
-              <w:t>${mon_check_column}</w:t>
+              <w:t>${</w:t>
+            </w:r>
+            <w:proofErr w:type="spellStart"/>
+            <w:r>
+              <w:rPr>
+                <w:rFonts w:ascii="Times New Roman"/>
+                <w:sz w:val="6"/>
+                <w:szCs w:val="8"/>
+              </w:rPr>
+              <w:t>mon_check_column</w:t>
+            </w:r>
+            <w:proofErr w:type="spellEnd"/>
+            <w:r>
+              <w:rPr>
+                <w:rFonts w:ascii="Times New Roman"/>
+                <w:sz w:val="6"/>
+                <w:szCs w:val="8"/>
+              </w:rPr>
+              <w:t>}</w:t>
             </w:r>
           </w:p>
         </w:tc>
@@ -3858,7 +5416,25 @@
                 <w:sz w:val="6"/>
                 <w:szCs w:val="8"/>
               </w:rPr>
-              <w:t>${sun_check_column}</w:t>
+              <w:t>${</w:t>
+            </w:r>
+            <w:proofErr w:type="spellStart"/>
+            <w:r>
+              <w:rPr>
+                <w:rFonts w:ascii="Times New Roman"/>
+                <w:sz w:val="6"/>
+                <w:szCs w:val="8"/>
+              </w:rPr>
+              <w:t>sun_check_column</w:t>
+            </w:r>
+            <w:proofErr w:type="spellEnd"/>
+            <w:r>
+              <w:rPr>
+                <w:rFonts w:ascii="Times New Roman"/>
+                <w:sz w:val="6"/>
+                <w:szCs w:val="8"/>
+              </w:rPr>
+              <w:t>}</w:t>
             </w:r>
           </w:p>
         </w:tc>
@@ -3873,7 +5449,25 @@
                 <w:sz w:val="6"/>
                 <w:szCs w:val="8"/>
               </w:rPr>
-              <w:t>${sat_check_column}</w:t>
+              <w:t>${</w:t>
+            </w:r>
+            <w:proofErr w:type="spellStart"/>
+            <w:r>
+              <w:rPr>
+                <w:rFonts w:ascii="Times New Roman"/>
+                <w:sz w:val="6"/>
+                <w:szCs w:val="8"/>
+              </w:rPr>
+              <w:t>sat_check_column</w:t>
+            </w:r>
+            <w:proofErr w:type="spellEnd"/>
+            <w:r>
+              <w:rPr>
+                <w:rFonts w:ascii="Times New Roman"/>
+                <w:sz w:val="6"/>
+                <w:szCs w:val="8"/>
+              </w:rPr>
+              <w:t>}</w:t>
             </w:r>
           </w:p>
         </w:tc>
@@ -3954,7 +5548,25 @@
                 <w:sz w:val="6"/>
                 <w:szCs w:val="8"/>
               </w:rPr>
-              <w:t>${fri_check_column}</w:t>
+              <w:t>${</w:t>
+            </w:r>
+            <w:proofErr w:type="spellStart"/>
+            <w:r>
+              <w:rPr>
+                <w:rFonts w:ascii="Times New Roman"/>
+                <w:sz w:val="6"/>
+                <w:szCs w:val="8"/>
+              </w:rPr>
+              <w:t>fri_check_column</w:t>
+            </w:r>
+            <w:proofErr w:type="spellEnd"/>
+            <w:r>
+              <w:rPr>
+                <w:rFonts w:ascii="Times New Roman"/>
+                <w:sz w:val="6"/>
+                <w:szCs w:val="8"/>
+              </w:rPr>
+              <w:t>}</w:t>
             </w:r>
           </w:p>
         </w:tc>
@@ -3969,7 +5581,25 @@
                 <w:sz w:val="6"/>
                 <w:szCs w:val="8"/>
               </w:rPr>
-              <w:t>${thu_check_column}</w:t>
+              <w:t>${</w:t>
+            </w:r>
+            <w:proofErr w:type="spellStart"/>
+            <w:r>
+              <w:rPr>
+                <w:rFonts w:ascii="Times New Roman"/>
+                <w:sz w:val="6"/>
+                <w:szCs w:val="8"/>
+              </w:rPr>
+              <w:t>thu_check_column</w:t>
+            </w:r>
+            <w:proofErr w:type="spellEnd"/>
+            <w:r>
+              <w:rPr>
+                <w:rFonts w:ascii="Times New Roman"/>
+                <w:sz w:val="6"/>
+                <w:szCs w:val="8"/>
+              </w:rPr>
+              <w:t>}</w:t>
             </w:r>
           </w:p>
         </w:tc>
@@ -3984,7 +5614,25 @@
                 <w:sz w:val="6"/>
                 <w:szCs w:val="8"/>
               </w:rPr>
-              <w:t>${wed_check_column}</w:t>
+              <w:t>${</w:t>
+            </w:r>
+            <w:proofErr w:type="spellStart"/>
+            <w:r>
+              <w:rPr>
+                <w:rFonts w:ascii="Times New Roman"/>
+                <w:sz w:val="6"/>
+                <w:szCs w:val="8"/>
+              </w:rPr>
+              <w:t>wed_check_column</w:t>
+            </w:r>
+            <w:proofErr w:type="spellEnd"/>
+            <w:r>
+              <w:rPr>
+                <w:rFonts w:ascii="Times New Roman"/>
+                <w:sz w:val="6"/>
+                <w:szCs w:val="8"/>
+              </w:rPr>
+              <w:t>}</w:t>
             </w:r>
           </w:p>
         </w:tc>
@@ -3999,7 +5647,25 @@
                 <w:sz w:val="6"/>
                 <w:szCs w:val="8"/>
               </w:rPr>
-              <w:t>${tue_check_column}</w:t>
+              <w:t>${</w:t>
+            </w:r>
+            <w:proofErr w:type="spellStart"/>
+            <w:r>
+              <w:rPr>
+                <w:rFonts w:ascii="Times New Roman"/>
+                <w:sz w:val="6"/>
+                <w:szCs w:val="8"/>
+              </w:rPr>
+              <w:t>tue_check_column</w:t>
+            </w:r>
+            <w:proofErr w:type="spellEnd"/>
+            <w:r>
+              <w:rPr>
+                <w:rFonts w:ascii="Times New Roman"/>
+                <w:sz w:val="6"/>
+                <w:szCs w:val="8"/>
+              </w:rPr>
+              <w:t>}</w:t>
             </w:r>
           </w:p>
         </w:tc>
@@ -4014,7 +5680,25 @@
                 <w:sz w:val="6"/>
                 <w:szCs w:val="8"/>
               </w:rPr>
-              <w:t>${mon_check_column}</w:t>
+              <w:t>${</w:t>
+            </w:r>
+            <w:proofErr w:type="spellStart"/>
+            <w:r>
+              <w:rPr>
+                <w:rFonts w:ascii="Times New Roman"/>
+                <w:sz w:val="6"/>
+                <w:szCs w:val="8"/>
+              </w:rPr>
+              <w:t>mon_check_column</w:t>
+            </w:r>
+            <w:proofErr w:type="spellEnd"/>
+            <w:r>
+              <w:rPr>
+                <w:rFonts w:ascii="Times New Roman"/>
+                <w:sz w:val="6"/>
+                <w:szCs w:val="8"/>
+              </w:rPr>
+              <w:t>}</w:t>
             </w:r>
           </w:p>
         </w:tc>
@@ -4029,7 +5713,25 @@
                 <w:sz w:val="6"/>
                 <w:szCs w:val="8"/>
               </w:rPr>
-              <w:t>${sun_check_column}</w:t>
+              <w:t>${</w:t>
+            </w:r>
+            <w:proofErr w:type="spellStart"/>
+            <w:r>
+              <w:rPr>
+                <w:rFonts w:ascii="Times New Roman"/>
+                <w:sz w:val="6"/>
+                <w:szCs w:val="8"/>
+              </w:rPr>
+              <w:t>sun_check_column</w:t>
+            </w:r>
+            <w:proofErr w:type="spellEnd"/>
+            <w:r>
+              <w:rPr>
+                <w:rFonts w:ascii="Times New Roman"/>
+                <w:sz w:val="6"/>
+                <w:szCs w:val="8"/>
+              </w:rPr>
+              <w:t>}</w:t>
             </w:r>
           </w:p>
         </w:tc>
@@ -4044,7 +5746,25 @@
                 <w:sz w:val="6"/>
                 <w:szCs w:val="8"/>
               </w:rPr>
-              <w:t>${sat_check_column}</w:t>
+              <w:t>${</w:t>
+            </w:r>
+            <w:proofErr w:type="spellStart"/>
+            <w:r>
+              <w:rPr>
+                <w:rFonts w:ascii="Times New Roman"/>
+                <w:sz w:val="6"/>
+                <w:szCs w:val="8"/>
+              </w:rPr>
+              <w:t>sat_check_column</w:t>
+            </w:r>
+            <w:proofErr w:type="spellEnd"/>
+            <w:r>
+              <w:rPr>
+                <w:rFonts w:ascii="Times New Roman"/>
+                <w:sz w:val="6"/>
+                <w:szCs w:val="8"/>
+              </w:rPr>
+              <w:t>}</w:t>
             </w:r>
           </w:p>
         </w:tc>
@@ -4125,7 +5845,25 @@
                 <w:sz w:val="6"/>
                 <w:szCs w:val="8"/>
               </w:rPr>
-              <w:t>${fri_check_column}</w:t>
+              <w:t>${</w:t>
+            </w:r>
+            <w:proofErr w:type="spellStart"/>
+            <w:r>
+              <w:rPr>
+                <w:rFonts w:ascii="Times New Roman"/>
+                <w:sz w:val="6"/>
+                <w:szCs w:val="8"/>
+              </w:rPr>
+              <w:t>fri_check_column</w:t>
+            </w:r>
+            <w:proofErr w:type="spellEnd"/>
+            <w:r>
+              <w:rPr>
+                <w:rFonts w:ascii="Times New Roman"/>
+                <w:sz w:val="6"/>
+                <w:szCs w:val="8"/>
+              </w:rPr>
+              <w:t>}</w:t>
             </w:r>
           </w:p>
         </w:tc>
@@ -4140,7 +5878,25 @@
                 <w:sz w:val="6"/>
                 <w:szCs w:val="8"/>
               </w:rPr>
-              <w:t>${thu_check_column}</w:t>
+              <w:t>${</w:t>
+            </w:r>
+            <w:proofErr w:type="spellStart"/>
+            <w:r>
+              <w:rPr>
+                <w:rFonts w:ascii="Times New Roman"/>
+                <w:sz w:val="6"/>
+                <w:szCs w:val="8"/>
+              </w:rPr>
+              <w:t>thu_check_column</w:t>
+            </w:r>
+            <w:proofErr w:type="spellEnd"/>
+            <w:r>
+              <w:rPr>
+                <w:rFonts w:ascii="Times New Roman"/>
+                <w:sz w:val="6"/>
+                <w:szCs w:val="8"/>
+              </w:rPr>
+              <w:t>}</w:t>
             </w:r>
           </w:p>
         </w:tc>
@@ -4155,7 +5911,25 @@
                 <w:sz w:val="6"/>
                 <w:szCs w:val="8"/>
               </w:rPr>
-              <w:t>${wed_check_column}</w:t>
+              <w:t>${</w:t>
+            </w:r>
+            <w:proofErr w:type="spellStart"/>
+            <w:r>
+              <w:rPr>
+                <w:rFonts w:ascii="Times New Roman"/>
+                <w:sz w:val="6"/>
+                <w:szCs w:val="8"/>
+              </w:rPr>
+              <w:t>wed_check_column</w:t>
+            </w:r>
+            <w:proofErr w:type="spellEnd"/>
+            <w:r>
+              <w:rPr>
+                <w:rFonts w:ascii="Times New Roman"/>
+                <w:sz w:val="6"/>
+                <w:szCs w:val="8"/>
+              </w:rPr>
+              <w:t>}</w:t>
             </w:r>
           </w:p>
         </w:tc>
@@ -4170,7 +5944,25 @@
                 <w:sz w:val="6"/>
                 <w:szCs w:val="8"/>
               </w:rPr>
-              <w:t>${tue_check_column}</w:t>
+              <w:t>${</w:t>
+            </w:r>
+            <w:proofErr w:type="spellStart"/>
+            <w:r>
+              <w:rPr>
+                <w:rFonts w:ascii="Times New Roman"/>
+                <w:sz w:val="6"/>
+                <w:szCs w:val="8"/>
+              </w:rPr>
+              <w:t>tue_check_column</w:t>
+            </w:r>
+            <w:proofErr w:type="spellEnd"/>
+            <w:r>
+              <w:rPr>
+                <w:rFonts w:ascii="Times New Roman"/>
+                <w:sz w:val="6"/>
+                <w:szCs w:val="8"/>
+              </w:rPr>
+              <w:t>}</w:t>
             </w:r>
           </w:p>
         </w:tc>
@@ -4185,7 +5977,25 @@
                 <w:sz w:val="6"/>
                 <w:szCs w:val="8"/>
               </w:rPr>
-              <w:t>${mon_check_column}</w:t>
+              <w:t>${</w:t>
+            </w:r>
+            <w:proofErr w:type="spellStart"/>
+            <w:r>
+              <w:rPr>
+                <w:rFonts w:ascii="Times New Roman"/>
+                <w:sz w:val="6"/>
+                <w:szCs w:val="8"/>
+              </w:rPr>
+              <w:t>mon_check_column</w:t>
+            </w:r>
+            <w:proofErr w:type="spellEnd"/>
+            <w:r>
+              <w:rPr>
+                <w:rFonts w:ascii="Times New Roman"/>
+                <w:sz w:val="6"/>
+                <w:szCs w:val="8"/>
+              </w:rPr>
+              <w:t>}</w:t>
             </w:r>
           </w:p>
         </w:tc>
@@ -4200,7 +6010,25 @@
                 <w:sz w:val="6"/>
                 <w:szCs w:val="8"/>
               </w:rPr>
-              <w:t>${sun_check_column}</w:t>
+              <w:t>${</w:t>
+            </w:r>
+            <w:proofErr w:type="spellStart"/>
+            <w:r>
+              <w:rPr>
+                <w:rFonts w:ascii="Times New Roman"/>
+                <w:sz w:val="6"/>
+                <w:szCs w:val="8"/>
+              </w:rPr>
+              <w:t>sun_check_column</w:t>
+            </w:r>
+            <w:proofErr w:type="spellEnd"/>
+            <w:r>
+              <w:rPr>
+                <w:rFonts w:ascii="Times New Roman"/>
+                <w:sz w:val="6"/>
+                <w:szCs w:val="8"/>
+              </w:rPr>
+              <w:t>}</w:t>
             </w:r>
           </w:p>
         </w:tc>
@@ -4215,7 +6043,25 @@
                 <w:sz w:val="6"/>
                 <w:szCs w:val="8"/>
               </w:rPr>
-              <w:t>${sat_check_column}</w:t>
+              <w:t>${</w:t>
+            </w:r>
+            <w:proofErr w:type="spellStart"/>
+            <w:r>
+              <w:rPr>
+                <w:rFonts w:ascii="Times New Roman"/>
+                <w:sz w:val="6"/>
+                <w:szCs w:val="8"/>
+              </w:rPr>
+              <w:t>sat_check_column</w:t>
+            </w:r>
+            <w:proofErr w:type="spellEnd"/>
+            <w:r>
+              <w:rPr>
+                <w:rFonts w:ascii="Times New Roman"/>
+                <w:sz w:val="6"/>
+                <w:szCs w:val="8"/>
+              </w:rPr>
+              <w:t>}</w:t>
             </w:r>
           </w:p>
         </w:tc>
@@ -4296,7 +6142,25 @@
                 <w:sz w:val="6"/>
                 <w:szCs w:val="8"/>
               </w:rPr>
-              <w:t>${fri_check_column}</w:t>
+              <w:t>${</w:t>
+            </w:r>
+            <w:proofErr w:type="spellStart"/>
+            <w:r>
+              <w:rPr>
+                <w:rFonts w:ascii="Times New Roman"/>
+                <w:sz w:val="6"/>
+                <w:szCs w:val="8"/>
+              </w:rPr>
+              <w:t>fri_check_column</w:t>
+            </w:r>
+            <w:proofErr w:type="spellEnd"/>
+            <w:r>
+              <w:rPr>
+                <w:rFonts w:ascii="Times New Roman"/>
+                <w:sz w:val="6"/>
+                <w:szCs w:val="8"/>
+              </w:rPr>
+              <w:t>}</w:t>
             </w:r>
           </w:p>
         </w:tc>
@@ -4311,7 +6175,25 @@
                 <w:sz w:val="6"/>
                 <w:szCs w:val="8"/>
               </w:rPr>
-              <w:t>${thu_check_column}</w:t>
+              <w:t>${</w:t>
+            </w:r>
+            <w:proofErr w:type="spellStart"/>
+            <w:r>
+              <w:rPr>
+                <w:rFonts w:ascii="Times New Roman"/>
+                <w:sz w:val="6"/>
+                <w:szCs w:val="8"/>
+              </w:rPr>
+              <w:t>thu_check_column</w:t>
+            </w:r>
+            <w:proofErr w:type="spellEnd"/>
+            <w:r>
+              <w:rPr>
+                <w:rFonts w:ascii="Times New Roman"/>
+                <w:sz w:val="6"/>
+                <w:szCs w:val="8"/>
+              </w:rPr>
+              <w:t>}</w:t>
             </w:r>
           </w:p>
         </w:tc>
@@ -4326,7 +6208,25 @@
                 <w:sz w:val="6"/>
                 <w:szCs w:val="8"/>
               </w:rPr>
-              <w:t>${wed_check_column}</w:t>
+              <w:t>${</w:t>
+            </w:r>
+            <w:proofErr w:type="spellStart"/>
+            <w:r>
+              <w:rPr>
+                <w:rFonts w:ascii="Times New Roman"/>
+                <w:sz w:val="6"/>
+                <w:szCs w:val="8"/>
+              </w:rPr>
+              <w:t>wed_check_column</w:t>
+            </w:r>
+            <w:proofErr w:type="spellEnd"/>
+            <w:r>
+              <w:rPr>
+                <w:rFonts w:ascii="Times New Roman"/>
+                <w:sz w:val="6"/>
+                <w:szCs w:val="8"/>
+              </w:rPr>
+              <w:t>}</w:t>
             </w:r>
           </w:p>
         </w:tc>
@@ -4341,7 +6241,25 @@
                 <w:sz w:val="6"/>
                 <w:szCs w:val="8"/>
               </w:rPr>
-              <w:t>${tue_check_column}</w:t>
+              <w:t>${</w:t>
+            </w:r>
+            <w:proofErr w:type="spellStart"/>
+            <w:r>
+              <w:rPr>
+                <w:rFonts w:ascii="Times New Roman"/>
+                <w:sz w:val="6"/>
+                <w:szCs w:val="8"/>
+              </w:rPr>
+              <w:t>tue_check_column</w:t>
+            </w:r>
+            <w:proofErr w:type="spellEnd"/>
+            <w:r>
+              <w:rPr>
+                <w:rFonts w:ascii="Times New Roman"/>
+                <w:sz w:val="6"/>
+                <w:szCs w:val="8"/>
+              </w:rPr>
+              <w:t>}</w:t>
             </w:r>
           </w:p>
         </w:tc>
@@ -4356,7 +6274,25 @@
                 <w:sz w:val="6"/>
                 <w:szCs w:val="8"/>
               </w:rPr>
-              <w:t>${mon_check_column}</w:t>
+              <w:t>${</w:t>
+            </w:r>
+            <w:proofErr w:type="spellStart"/>
+            <w:r>
+              <w:rPr>
+                <w:rFonts w:ascii="Times New Roman"/>
+                <w:sz w:val="6"/>
+                <w:szCs w:val="8"/>
+              </w:rPr>
+              <w:t>mon_check_column</w:t>
+            </w:r>
+            <w:proofErr w:type="spellEnd"/>
+            <w:r>
+              <w:rPr>
+                <w:rFonts w:ascii="Times New Roman"/>
+                <w:sz w:val="6"/>
+                <w:szCs w:val="8"/>
+              </w:rPr>
+              <w:t>}</w:t>
             </w:r>
           </w:p>
         </w:tc>
@@ -4371,7 +6307,25 @@
                 <w:sz w:val="6"/>
                 <w:szCs w:val="8"/>
               </w:rPr>
-              <w:t>${sun_check_column}</w:t>
+              <w:t>${</w:t>
+            </w:r>
+            <w:proofErr w:type="spellStart"/>
+            <w:r>
+              <w:rPr>
+                <w:rFonts w:ascii="Times New Roman"/>
+                <w:sz w:val="6"/>
+                <w:szCs w:val="8"/>
+              </w:rPr>
+              <w:t>sun_check_column</w:t>
+            </w:r>
+            <w:proofErr w:type="spellEnd"/>
+            <w:r>
+              <w:rPr>
+                <w:rFonts w:ascii="Times New Roman"/>
+                <w:sz w:val="6"/>
+                <w:szCs w:val="8"/>
+              </w:rPr>
+              <w:t>}</w:t>
             </w:r>
           </w:p>
         </w:tc>
@@ -4386,7 +6340,25 @@
                 <w:sz w:val="6"/>
                 <w:szCs w:val="8"/>
               </w:rPr>
-              <w:t>${sat_check_column}</w:t>
+              <w:t>${</w:t>
+            </w:r>
+            <w:proofErr w:type="spellStart"/>
+            <w:r>
+              <w:rPr>
+                <w:rFonts w:ascii="Times New Roman"/>
+                <w:sz w:val="6"/>
+                <w:szCs w:val="8"/>
+              </w:rPr>
+              <w:t>sat_check_column</w:t>
+            </w:r>
+            <w:proofErr w:type="spellEnd"/>
+            <w:r>
+              <w:rPr>
+                <w:rFonts w:ascii="Times New Roman"/>
+                <w:sz w:val="6"/>
+                <w:szCs w:val="8"/>
+              </w:rPr>
+              <w:t>}</w:t>
             </w:r>
           </w:p>
         </w:tc>
@@ -4467,7 +6439,25 @@
                 <w:sz w:val="6"/>
                 <w:szCs w:val="8"/>
               </w:rPr>
-              <w:t>${fri_check_column}</w:t>
+              <w:t>${</w:t>
+            </w:r>
+            <w:proofErr w:type="spellStart"/>
+            <w:r>
+              <w:rPr>
+                <w:rFonts w:ascii="Times New Roman"/>
+                <w:sz w:val="6"/>
+                <w:szCs w:val="8"/>
+              </w:rPr>
+              <w:t>fri_check_column</w:t>
+            </w:r>
+            <w:proofErr w:type="spellEnd"/>
+            <w:r>
+              <w:rPr>
+                <w:rFonts w:ascii="Times New Roman"/>
+                <w:sz w:val="6"/>
+                <w:szCs w:val="8"/>
+              </w:rPr>
+              <w:t>}</w:t>
             </w:r>
           </w:p>
         </w:tc>
@@ -4482,7 +6472,25 @@
                 <w:sz w:val="6"/>
                 <w:szCs w:val="8"/>
               </w:rPr>
-              <w:t>${thu_check_column}</w:t>
+              <w:t>${</w:t>
+            </w:r>
+            <w:proofErr w:type="spellStart"/>
+            <w:r>
+              <w:rPr>
+                <w:rFonts w:ascii="Times New Roman"/>
+                <w:sz w:val="6"/>
+                <w:szCs w:val="8"/>
+              </w:rPr>
+              <w:t>thu_check_column</w:t>
+            </w:r>
+            <w:proofErr w:type="spellEnd"/>
+            <w:r>
+              <w:rPr>
+                <w:rFonts w:ascii="Times New Roman"/>
+                <w:sz w:val="6"/>
+                <w:szCs w:val="8"/>
+              </w:rPr>
+              <w:t>}</w:t>
             </w:r>
           </w:p>
         </w:tc>
@@ -4497,7 +6505,25 @@
                 <w:sz w:val="6"/>
                 <w:szCs w:val="8"/>
               </w:rPr>
-              <w:t>${wed_check_column}</w:t>
+              <w:t>${</w:t>
+            </w:r>
+            <w:proofErr w:type="spellStart"/>
+            <w:r>
+              <w:rPr>
+                <w:rFonts w:ascii="Times New Roman"/>
+                <w:sz w:val="6"/>
+                <w:szCs w:val="8"/>
+              </w:rPr>
+              <w:t>wed_check_column</w:t>
+            </w:r>
+            <w:proofErr w:type="spellEnd"/>
+            <w:r>
+              <w:rPr>
+                <w:rFonts w:ascii="Times New Roman"/>
+                <w:sz w:val="6"/>
+                <w:szCs w:val="8"/>
+              </w:rPr>
+              <w:t>}</w:t>
             </w:r>
           </w:p>
         </w:tc>
@@ -4512,7 +6538,25 @@
                 <w:sz w:val="6"/>
                 <w:szCs w:val="8"/>
               </w:rPr>
-              <w:t>${tue_check_column}</w:t>
+              <w:t>${</w:t>
+            </w:r>
+            <w:proofErr w:type="spellStart"/>
+            <w:r>
+              <w:rPr>
+                <w:rFonts w:ascii="Times New Roman"/>
+                <w:sz w:val="6"/>
+                <w:szCs w:val="8"/>
+              </w:rPr>
+              <w:t>tue_check_column</w:t>
+            </w:r>
+            <w:proofErr w:type="spellEnd"/>
+            <w:r>
+              <w:rPr>
+                <w:rFonts w:ascii="Times New Roman"/>
+                <w:sz w:val="6"/>
+                <w:szCs w:val="8"/>
+              </w:rPr>
+              <w:t>}</w:t>
             </w:r>
           </w:p>
         </w:tc>
@@ -4527,7 +6571,25 @@
                 <w:sz w:val="6"/>
                 <w:szCs w:val="8"/>
               </w:rPr>
-              <w:t>${mon_check_column}</w:t>
+              <w:t>${</w:t>
+            </w:r>
+            <w:proofErr w:type="spellStart"/>
+            <w:r>
+              <w:rPr>
+                <w:rFonts w:ascii="Times New Roman"/>
+                <w:sz w:val="6"/>
+                <w:szCs w:val="8"/>
+              </w:rPr>
+              <w:t>mon_check_column</w:t>
+            </w:r>
+            <w:proofErr w:type="spellEnd"/>
+            <w:r>
+              <w:rPr>
+                <w:rFonts w:ascii="Times New Roman"/>
+                <w:sz w:val="6"/>
+                <w:szCs w:val="8"/>
+              </w:rPr>
+              <w:t>}</w:t>
             </w:r>
           </w:p>
         </w:tc>
@@ -4542,7 +6604,25 @@
                 <w:sz w:val="6"/>
                 <w:szCs w:val="8"/>
               </w:rPr>
-              <w:t>${sun_check_column}</w:t>
+              <w:t>${</w:t>
+            </w:r>
+            <w:proofErr w:type="spellStart"/>
+            <w:r>
+              <w:rPr>
+                <w:rFonts w:ascii="Times New Roman"/>
+                <w:sz w:val="6"/>
+                <w:szCs w:val="8"/>
+              </w:rPr>
+              <w:t>sun_check_column</w:t>
+            </w:r>
+            <w:proofErr w:type="spellEnd"/>
+            <w:r>
+              <w:rPr>
+                <w:rFonts w:ascii="Times New Roman"/>
+                <w:sz w:val="6"/>
+                <w:szCs w:val="8"/>
+              </w:rPr>
+              <w:t>}</w:t>
             </w:r>
           </w:p>
         </w:tc>
@@ -4557,7 +6637,25 @@
                 <w:sz w:val="6"/>
                 <w:szCs w:val="8"/>
               </w:rPr>
-              <w:t>${sat_check_column}</w:t>
+              <w:t>${</w:t>
+            </w:r>
+            <w:proofErr w:type="spellStart"/>
+            <w:r>
+              <w:rPr>
+                <w:rFonts w:ascii="Times New Roman"/>
+                <w:sz w:val="6"/>
+                <w:szCs w:val="8"/>
+              </w:rPr>
+              <w:t>sat_check_column</w:t>
+            </w:r>
+            <w:proofErr w:type="spellEnd"/>
+            <w:r>
+              <w:rPr>
+                <w:rFonts w:ascii="Times New Roman"/>
+                <w:sz w:val="6"/>
+                <w:szCs w:val="8"/>
+              </w:rPr>
+              <w:t>}</w:t>
             </w:r>
           </w:p>
         </w:tc>
@@ -4587,7 +6685,29 @@
                 <w:szCs w:val="18"/>
                 <w:rtl/>
               </w:rPr>
-              <w:t>يجب التأكد من رافعة الكوريك ومفتاح الربط والإطار الاحتياطي</w:t>
+              <w:t xml:space="preserve">يجب التأكد من رافعة </w:t>
+            </w:r>
+            <w:proofErr w:type="spellStart"/>
+            <w:r>
+              <w:rPr>
+                <w:b/>
+                <w:bCs/>
+                <w:sz w:val="18"/>
+                <w:szCs w:val="18"/>
+                <w:rtl/>
+              </w:rPr>
+              <w:t>الكوريك</w:t>
+            </w:r>
+            <w:proofErr w:type="spellEnd"/>
+            <w:r>
+              <w:rPr>
+                <w:b/>
+                <w:bCs/>
+                <w:sz w:val="18"/>
+                <w:szCs w:val="18"/>
+                <w:rtl/>
+              </w:rPr>
+              <w:t xml:space="preserve"> ومفتاح الربط والإطار الاحتياطي</w:t>
             </w:r>
           </w:p>
           <w:p>
@@ -4648,7 +6768,25 @@
                 <w:sz w:val="6"/>
                 <w:szCs w:val="8"/>
               </w:rPr>
-              <w:t>${fri_check_column}</w:t>
+              <w:t>${</w:t>
+            </w:r>
+            <w:proofErr w:type="spellStart"/>
+            <w:r>
+              <w:rPr>
+                <w:rFonts w:ascii="Times New Roman"/>
+                <w:sz w:val="6"/>
+                <w:szCs w:val="8"/>
+              </w:rPr>
+              <w:t>fri_check_column</w:t>
+            </w:r>
+            <w:proofErr w:type="spellEnd"/>
+            <w:r>
+              <w:rPr>
+                <w:rFonts w:ascii="Times New Roman"/>
+                <w:sz w:val="6"/>
+                <w:szCs w:val="8"/>
+              </w:rPr>
+              <w:t>}</w:t>
             </w:r>
           </w:p>
         </w:tc>
@@ -4663,7 +6801,25 @@
                 <w:sz w:val="6"/>
                 <w:szCs w:val="8"/>
               </w:rPr>
-              <w:t>${thu_check_column}</w:t>
+              <w:t>${</w:t>
+            </w:r>
+            <w:proofErr w:type="spellStart"/>
+            <w:r>
+              <w:rPr>
+                <w:rFonts w:ascii="Times New Roman"/>
+                <w:sz w:val="6"/>
+                <w:szCs w:val="8"/>
+              </w:rPr>
+              <w:t>thu_check_column</w:t>
+            </w:r>
+            <w:proofErr w:type="spellEnd"/>
+            <w:r>
+              <w:rPr>
+                <w:rFonts w:ascii="Times New Roman"/>
+                <w:sz w:val="6"/>
+                <w:szCs w:val="8"/>
+              </w:rPr>
+              <w:t>}</w:t>
             </w:r>
           </w:p>
         </w:tc>
@@ -4678,7 +6834,25 @@
                 <w:sz w:val="6"/>
                 <w:szCs w:val="8"/>
               </w:rPr>
-              <w:t>${wed_check_column}</w:t>
+              <w:t>${</w:t>
+            </w:r>
+            <w:proofErr w:type="spellStart"/>
+            <w:r>
+              <w:rPr>
+                <w:rFonts w:ascii="Times New Roman"/>
+                <w:sz w:val="6"/>
+                <w:szCs w:val="8"/>
+              </w:rPr>
+              <w:t>wed_check_column</w:t>
+            </w:r>
+            <w:proofErr w:type="spellEnd"/>
+            <w:r>
+              <w:rPr>
+                <w:rFonts w:ascii="Times New Roman"/>
+                <w:sz w:val="6"/>
+                <w:szCs w:val="8"/>
+              </w:rPr>
+              <w:t>}</w:t>
             </w:r>
           </w:p>
         </w:tc>
@@ -4693,7 +6867,25 @@
                 <w:sz w:val="6"/>
                 <w:szCs w:val="8"/>
               </w:rPr>
-              <w:t>${tue_check_column}</w:t>
+              <w:t>${</w:t>
+            </w:r>
+            <w:proofErr w:type="spellStart"/>
+            <w:r>
+              <w:rPr>
+                <w:rFonts w:ascii="Times New Roman"/>
+                <w:sz w:val="6"/>
+                <w:szCs w:val="8"/>
+              </w:rPr>
+              <w:t>tue_check_column</w:t>
+            </w:r>
+            <w:proofErr w:type="spellEnd"/>
+            <w:r>
+              <w:rPr>
+                <w:rFonts w:ascii="Times New Roman"/>
+                <w:sz w:val="6"/>
+                <w:szCs w:val="8"/>
+              </w:rPr>
+              <w:t>}</w:t>
             </w:r>
           </w:p>
         </w:tc>
@@ -4708,7 +6900,25 @@
                 <w:sz w:val="6"/>
                 <w:szCs w:val="8"/>
               </w:rPr>
-              <w:t>${mon_check_column}</w:t>
+              <w:t>${</w:t>
+            </w:r>
+            <w:proofErr w:type="spellStart"/>
+            <w:r>
+              <w:rPr>
+                <w:rFonts w:ascii="Times New Roman"/>
+                <w:sz w:val="6"/>
+                <w:szCs w:val="8"/>
+              </w:rPr>
+              <w:t>mon_check_column</w:t>
+            </w:r>
+            <w:proofErr w:type="spellEnd"/>
+            <w:r>
+              <w:rPr>
+                <w:rFonts w:ascii="Times New Roman"/>
+                <w:sz w:val="6"/>
+                <w:szCs w:val="8"/>
+              </w:rPr>
+              <w:t>}</w:t>
             </w:r>
           </w:p>
         </w:tc>
@@ -4723,7 +6933,25 @@
                 <w:sz w:val="6"/>
                 <w:szCs w:val="8"/>
               </w:rPr>
-              <w:t>${sun_check_column}</w:t>
+              <w:t>${</w:t>
+            </w:r>
+            <w:proofErr w:type="spellStart"/>
+            <w:r>
+              <w:rPr>
+                <w:rFonts w:ascii="Times New Roman"/>
+                <w:sz w:val="6"/>
+                <w:szCs w:val="8"/>
+              </w:rPr>
+              <w:t>sun_check_column</w:t>
+            </w:r>
+            <w:proofErr w:type="spellEnd"/>
+            <w:r>
+              <w:rPr>
+                <w:rFonts w:ascii="Times New Roman"/>
+                <w:sz w:val="6"/>
+                <w:szCs w:val="8"/>
+              </w:rPr>
+              <w:t>}</w:t>
             </w:r>
           </w:p>
         </w:tc>
@@ -4738,7 +6966,25 @@
                 <w:sz w:val="6"/>
                 <w:szCs w:val="8"/>
               </w:rPr>
-              <w:t>${sat_check_column}</w:t>
+              <w:t>${</w:t>
+            </w:r>
+            <w:proofErr w:type="spellStart"/>
+            <w:r>
+              <w:rPr>
+                <w:rFonts w:ascii="Times New Roman"/>
+                <w:sz w:val="6"/>
+                <w:szCs w:val="8"/>
+              </w:rPr>
+              <w:t>sat_check_column</w:t>
+            </w:r>
+            <w:proofErr w:type="spellEnd"/>
+            <w:r>
+              <w:rPr>
+                <w:rFonts w:ascii="Times New Roman"/>
+                <w:sz w:val="6"/>
+                <w:szCs w:val="8"/>
+              </w:rPr>
+              <w:t>}</w:t>
             </w:r>
           </w:p>
         </w:tc>
@@ -4829,7 +7075,25 @@
                 <w:sz w:val="6"/>
                 <w:szCs w:val="8"/>
               </w:rPr>
-              <w:t>${fri_check_column}</w:t>
+              <w:t>${</w:t>
+            </w:r>
+            <w:proofErr w:type="spellStart"/>
+            <w:r>
+              <w:rPr>
+                <w:rFonts w:ascii="Times New Roman"/>
+                <w:sz w:val="6"/>
+                <w:szCs w:val="8"/>
+              </w:rPr>
+              <w:t>fri_check_column</w:t>
+            </w:r>
+            <w:proofErr w:type="spellEnd"/>
+            <w:r>
+              <w:rPr>
+                <w:rFonts w:ascii="Times New Roman"/>
+                <w:sz w:val="6"/>
+                <w:szCs w:val="8"/>
+              </w:rPr>
+              <w:t>}</w:t>
             </w:r>
           </w:p>
         </w:tc>
@@ -4844,7 +7108,25 @@
                 <w:sz w:val="6"/>
                 <w:szCs w:val="8"/>
               </w:rPr>
-              <w:t>${thu_check_column}</w:t>
+              <w:t>${</w:t>
+            </w:r>
+            <w:proofErr w:type="spellStart"/>
+            <w:r>
+              <w:rPr>
+                <w:rFonts w:ascii="Times New Roman"/>
+                <w:sz w:val="6"/>
+                <w:szCs w:val="8"/>
+              </w:rPr>
+              <w:t>thu_check_column</w:t>
+            </w:r>
+            <w:proofErr w:type="spellEnd"/>
+            <w:r>
+              <w:rPr>
+                <w:rFonts w:ascii="Times New Roman"/>
+                <w:sz w:val="6"/>
+                <w:szCs w:val="8"/>
+              </w:rPr>
+              <w:t>}</w:t>
             </w:r>
           </w:p>
         </w:tc>
@@ -4859,7 +7141,25 @@
                 <w:sz w:val="6"/>
                 <w:szCs w:val="8"/>
               </w:rPr>
-              <w:t>${wed_check_column}</w:t>
+              <w:t>${</w:t>
+            </w:r>
+            <w:proofErr w:type="spellStart"/>
+            <w:r>
+              <w:rPr>
+                <w:rFonts w:ascii="Times New Roman"/>
+                <w:sz w:val="6"/>
+                <w:szCs w:val="8"/>
+              </w:rPr>
+              <w:t>wed_check_column</w:t>
+            </w:r>
+            <w:proofErr w:type="spellEnd"/>
+            <w:r>
+              <w:rPr>
+                <w:rFonts w:ascii="Times New Roman"/>
+                <w:sz w:val="6"/>
+                <w:szCs w:val="8"/>
+              </w:rPr>
+              <w:t>}</w:t>
             </w:r>
           </w:p>
         </w:tc>
@@ -4874,7 +7174,25 @@
                 <w:sz w:val="6"/>
                 <w:szCs w:val="8"/>
               </w:rPr>
-              <w:t>${tue_check_column}</w:t>
+              <w:t>${</w:t>
+            </w:r>
+            <w:proofErr w:type="spellStart"/>
+            <w:r>
+              <w:rPr>
+                <w:rFonts w:ascii="Times New Roman"/>
+                <w:sz w:val="6"/>
+                <w:szCs w:val="8"/>
+              </w:rPr>
+              <w:t>tue_check_column</w:t>
+            </w:r>
+            <w:proofErr w:type="spellEnd"/>
+            <w:r>
+              <w:rPr>
+                <w:rFonts w:ascii="Times New Roman"/>
+                <w:sz w:val="6"/>
+                <w:szCs w:val="8"/>
+              </w:rPr>
+              <w:t>}</w:t>
             </w:r>
           </w:p>
         </w:tc>
@@ -4889,7 +7207,25 @@
                 <w:sz w:val="6"/>
                 <w:szCs w:val="8"/>
               </w:rPr>
-              <w:t>${mon_check_column}</w:t>
+              <w:t>${</w:t>
+            </w:r>
+            <w:proofErr w:type="spellStart"/>
+            <w:r>
+              <w:rPr>
+                <w:rFonts w:ascii="Times New Roman"/>
+                <w:sz w:val="6"/>
+                <w:szCs w:val="8"/>
+              </w:rPr>
+              <w:t>mon_check_column</w:t>
+            </w:r>
+            <w:proofErr w:type="spellEnd"/>
+            <w:r>
+              <w:rPr>
+                <w:rFonts w:ascii="Times New Roman"/>
+                <w:sz w:val="6"/>
+                <w:szCs w:val="8"/>
+              </w:rPr>
+              <w:t>}</w:t>
             </w:r>
           </w:p>
         </w:tc>
@@ -4904,7 +7240,25 @@
                 <w:sz w:val="6"/>
                 <w:szCs w:val="8"/>
               </w:rPr>
-              <w:t>${sun_check_column}</w:t>
+              <w:t>${</w:t>
+            </w:r>
+            <w:proofErr w:type="spellStart"/>
+            <w:r>
+              <w:rPr>
+                <w:rFonts w:ascii="Times New Roman"/>
+                <w:sz w:val="6"/>
+                <w:szCs w:val="8"/>
+              </w:rPr>
+              <w:t>sun_check_column</w:t>
+            </w:r>
+            <w:proofErr w:type="spellEnd"/>
+            <w:r>
+              <w:rPr>
+                <w:rFonts w:ascii="Times New Roman"/>
+                <w:sz w:val="6"/>
+                <w:szCs w:val="8"/>
+              </w:rPr>
+              <w:t>}</w:t>
             </w:r>
           </w:p>
         </w:tc>
@@ -4919,7 +7273,25 @@
                 <w:sz w:val="6"/>
                 <w:szCs w:val="8"/>
               </w:rPr>
-              <w:t>${sat_check_column}</w:t>
+              <w:t>${</w:t>
+            </w:r>
+            <w:proofErr w:type="spellStart"/>
+            <w:r>
+              <w:rPr>
+                <w:rFonts w:ascii="Times New Roman"/>
+                <w:sz w:val="6"/>
+                <w:szCs w:val="8"/>
+              </w:rPr>
+              <w:t>sat_check_column</w:t>
+            </w:r>
+            <w:proofErr w:type="spellEnd"/>
+            <w:r>
+              <w:rPr>
+                <w:rFonts w:ascii="Times New Roman"/>
+                <w:sz w:val="6"/>
+                <w:szCs w:val="8"/>
+              </w:rPr>
+              <w:t>}</w:t>
             </w:r>
           </w:p>
         </w:tc>
@@ -5000,7 +7372,26 @@
                 <w:sz w:val="6"/>
                 <w:szCs w:val="8"/>
               </w:rPr>
-              <w:t>${fri_check_column}</w:t>
+              <w:lastRenderedPageBreak/>
+              <w:t>${</w:t>
+            </w:r>
+            <w:proofErr w:type="spellStart"/>
+            <w:r>
+              <w:rPr>
+                <w:rFonts w:ascii="Times New Roman"/>
+                <w:sz w:val="6"/>
+                <w:szCs w:val="8"/>
+              </w:rPr>
+              <w:t>fri_check_column</w:t>
+            </w:r>
+            <w:proofErr w:type="spellEnd"/>
+            <w:r>
+              <w:rPr>
+                <w:rFonts w:ascii="Times New Roman"/>
+                <w:sz w:val="6"/>
+                <w:szCs w:val="8"/>
+              </w:rPr>
+              <w:t>}</w:t>
             </w:r>
           </w:p>
         </w:tc>
@@ -5015,7 +7406,25 @@
                 <w:sz w:val="6"/>
                 <w:szCs w:val="8"/>
               </w:rPr>
-              <w:t>${thu_check_column}</w:t>
+              <w:t>${</w:t>
+            </w:r>
+            <w:proofErr w:type="spellStart"/>
+            <w:r>
+              <w:rPr>
+                <w:rFonts w:ascii="Times New Roman"/>
+                <w:sz w:val="6"/>
+                <w:szCs w:val="8"/>
+              </w:rPr>
+              <w:t>thu_check_column</w:t>
+            </w:r>
+            <w:proofErr w:type="spellEnd"/>
+            <w:r>
+              <w:rPr>
+                <w:rFonts w:ascii="Times New Roman"/>
+                <w:sz w:val="6"/>
+                <w:szCs w:val="8"/>
+              </w:rPr>
+              <w:t>}</w:t>
             </w:r>
           </w:p>
         </w:tc>
@@ -5030,7 +7439,25 @@
                 <w:sz w:val="6"/>
                 <w:szCs w:val="8"/>
               </w:rPr>
-              <w:t>${wed_check_column}</w:t>
+              <w:t>${</w:t>
+            </w:r>
+            <w:proofErr w:type="spellStart"/>
+            <w:r>
+              <w:rPr>
+                <w:rFonts w:ascii="Times New Roman"/>
+                <w:sz w:val="6"/>
+                <w:szCs w:val="8"/>
+              </w:rPr>
+              <w:t>wed_check_column</w:t>
+            </w:r>
+            <w:proofErr w:type="spellEnd"/>
+            <w:r>
+              <w:rPr>
+                <w:rFonts w:ascii="Times New Roman"/>
+                <w:sz w:val="6"/>
+                <w:szCs w:val="8"/>
+              </w:rPr>
+              <w:t>}</w:t>
             </w:r>
           </w:p>
         </w:tc>
@@ -5045,7 +7472,25 @@
                 <w:sz w:val="6"/>
                 <w:szCs w:val="8"/>
               </w:rPr>
-              <w:t>${tue_check_column}</w:t>
+              <w:t>${</w:t>
+            </w:r>
+            <w:proofErr w:type="spellStart"/>
+            <w:r>
+              <w:rPr>
+                <w:rFonts w:ascii="Times New Roman"/>
+                <w:sz w:val="6"/>
+                <w:szCs w:val="8"/>
+              </w:rPr>
+              <w:t>tue_check_column</w:t>
+            </w:r>
+            <w:proofErr w:type="spellEnd"/>
+            <w:r>
+              <w:rPr>
+                <w:rFonts w:ascii="Times New Roman"/>
+                <w:sz w:val="6"/>
+                <w:szCs w:val="8"/>
+              </w:rPr>
+              <w:t>}</w:t>
             </w:r>
           </w:p>
         </w:tc>
@@ -5060,7 +7505,25 @@
                 <w:sz w:val="6"/>
                 <w:szCs w:val="8"/>
               </w:rPr>
-              <w:t>${mon_check_column}</w:t>
+              <w:t>${</w:t>
+            </w:r>
+            <w:proofErr w:type="spellStart"/>
+            <w:r>
+              <w:rPr>
+                <w:rFonts w:ascii="Times New Roman"/>
+                <w:sz w:val="6"/>
+                <w:szCs w:val="8"/>
+              </w:rPr>
+              <w:t>mon_check_column</w:t>
+            </w:r>
+            <w:proofErr w:type="spellEnd"/>
+            <w:r>
+              <w:rPr>
+                <w:rFonts w:ascii="Times New Roman"/>
+                <w:sz w:val="6"/>
+                <w:szCs w:val="8"/>
+              </w:rPr>
+              <w:t>}</w:t>
             </w:r>
           </w:p>
         </w:tc>
@@ -5075,7 +7538,25 @@
                 <w:sz w:val="6"/>
                 <w:szCs w:val="8"/>
               </w:rPr>
-              <w:t>${sun_check_column}</w:t>
+              <w:t>${</w:t>
+            </w:r>
+            <w:proofErr w:type="spellStart"/>
+            <w:r>
+              <w:rPr>
+                <w:rFonts w:ascii="Times New Roman"/>
+                <w:sz w:val="6"/>
+                <w:szCs w:val="8"/>
+              </w:rPr>
+              <w:t>sun_check_column</w:t>
+            </w:r>
+            <w:proofErr w:type="spellEnd"/>
+            <w:r>
+              <w:rPr>
+                <w:rFonts w:ascii="Times New Roman"/>
+                <w:sz w:val="6"/>
+                <w:szCs w:val="8"/>
+              </w:rPr>
+              <w:t>}</w:t>
             </w:r>
           </w:p>
         </w:tc>
@@ -5090,7 +7571,25 @@
                 <w:sz w:val="6"/>
                 <w:szCs w:val="8"/>
               </w:rPr>
-              <w:t>${sat_check_column}</w:t>
+              <w:t>${</w:t>
+            </w:r>
+            <w:proofErr w:type="spellStart"/>
+            <w:r>
+              <w:rPr>
+                <w:rFonts w:ascii="Times New Roman"/>
+                <w:sz w:val="6"/>
+                <w:szCs w:val="8"/>
+              </w:rPr>
+              <w:t>sat_check_column</w:t>
+            </w:r>
+            <w:proofErr w:type="spellEnd"/>
+            <w:r>
+              <w:rPr>
+                <w:rFonts w:ascii="Times New Roman"/>
+                <w:sz w:val="6"/>
+                <w:szCs w:val="8"/>
+              </w:rPr>
+              <w:t>}</w:t>
             </w:r>
           </w:p>
         </w:tc>

</xml_diff>